<commit_message>
docs: add technical documentation, system flowcharts, and core order management pages including invoice and admin dashboard implementation.
</commit_message>
<xml_diff>
--- a/docs/User Documentation - Azmi Jalaluddin Amron _ NovaStore.docx
+++ b/docs/User Documentation - Azmi Jalaluddin Amron _ NovaStore.docx
@@ -7056,7 +7056,7 @@
         <mc:AlternateContent>
           <mc:Choice Requires="wps">
             <w:drawing>
-              <wp:anchor distT="0" distB="0" distL="0" distR="0" allowOverlap="1" layoutInCell="1" locked="0" behindDoc="1" simplePos="0" relativeHeight="487130624">
+              <wp:anchor distT="0" distB="0" distL="0" distR="0" allowOverlap="1" layoutInCell="1" locked="0" behindDoc="1" simplePos="0" relativeHeight="487132160">
                 <wp:simplePos x="0" y="0"/>
                 <wp:positionH relativeFrom="page">
                   <wp:posOffset>647699</wp:posOffset>
@@ -9257,7 +9257,7 @@
           </mc:Choice>
           <mc:Fallback>
             <w:pict>
-              <v:group style="position:absolute;margin-left:50.999996pt;margin-top:-33.260826pt;width:493.5pt;height:332.25pt;mso-position-horizontal-relative:page;mso-position-vertical-relative:paragraph;z-index:-16185856" id="docshapegroup5" coordorigin="1020,-665" coordsize="9870,6645">
+              <v:group style="position:absolute;margin-left:50.999996pt;margin-top:-33.260826pt;width:493.5pt;height:332.25pt;mso-position-horizontal-relative:page;mso-position-vertical-relative:paragraph;z-index:-16184320" id="docshapegroup5" coordorigin="1020,-665" coordsize="9870,6645">
                 <v:shape style="position:absolute;left:1020;top:-666;width:9865;height:6528" id="docshape6" coordorigin="1020,-665" coordsize="9865,6528" path="m10885,5863l1020,5863,1020,-665,10885,-665,10885,-396,1200,-396,1184,-395,1168,-393,1152,-389,1137,-383,1122,-376,1108,-368,1095,-358,1083,-347,1072,-335,1063,-323,1055,-309,1048,-294,1042,-279,1038,-263,1036,-247,1035,-231,1035,5304,1036,5320,1038,5336,1042,5352,1048,5367,1055,5382,1063,5396,1072,5409,1083,5421,1095,5432,1108,5441,1122,5450,1137,5457,1152,5462,1168,5466,1184,5468,1200,5469,10885,5469,10885,5863xm10885,5469l10710,5469,10726,5468,10742,5466,10758,5462,10773,5457,10788,5450,10802,5441,10815,5432,10827,5421,10838,5409,10847,5396,10855,5382,10862,5367,10868,5352,10872,5336,10874,5320,10875,5304,10875,-231,10874,-247,10872,-263,10868,-279,10862,-294,10855,-309,10847,-323,10838,-335,10827,-347,10815,-358,10802,-368,10788,-376,10773,-383,10758,-389,10742,-393,10726,-395,10710,-396,10885,-396,10885,5469xe" filled="true" fillcolor="#000000" stroked="false">
                   <v:path arrowok="t"/>
                   <v:fill opacity="9764f" type="solid"/>
@@ -12767,7 +12767,7 @@
         <mc:AlternateContent>
           <mc:Choice Requires="wps">
             <w:drawing>
-              <wp:anchor distT="0" distB="0" distL="0" distR="0" allowOverlap="1" layoutInCell="1" locked="0" behindDoc="1" simplePos="0" relativeHeight="487131648">
+              <wp:anchor distT="0" distB="0" distL="0" distR="0" allowOverlap="1" layoutInCell="1" locked="0" behindDoc="1" simplePos="0" relativeHeight="487133184">
                 <wp:simplePos x="0" y="0"/>
                 <wp:positionH relativeFrom="page">
                   <wp:posOffset>647699</wp:posOffset>
@@ -16624,7 +16624,7 @@
           </mc:Choice>
           <mc:Fallback>
             <w:pict>
-              <v:group style="position:absolute;margin-left:50.999996pt;margin-top:-311.98764pt;width:493.5pt;height:314.3pt;mso-position-horizontal-relative:page;mso-position-vertical-relative:paragraph;z-index:-16184832" id="docshapegroup24" coordorigin="1020,-6240" coordsize="9870,6286">
+              <v:group style="position:absolute;margin-left:50.999996pt;margin-top:-311.98764pt;width:493.5pt;height:314.3pt;mso-position-horizontal-relative:page;mso-position-vertical-relative:paragraph;z-index:-16183296" id="docshapegroup24" coordorigin="1020,-6240" coordsize="9870,6286">
                 <v:shape style="position:absolute;left:1020;top:-6240;width:9865;height:6286" id="docshape25" coordorigin="1020,-6240" coordsize="9865,6286" path="m10885,46l1020,46,1020,-6240,10885,-6240,10885,-6225,1200,-6225,1184,-6224,1168,-6222,1152,-6218,1137,-6212,1122,-6205,1108,-6197,1095,-6187,1083,-6176,1072,-6164,1063,-6151,1055,-6138,1048,-6123,1042,-6108,1038,-6092,1036,-6076,1035,-6060,1035,-510,1036,-493,1038,-478,1042,-462,1048,-447,1055,-432,1063,-418,1072,-405,1083,-393,1095,-382,1108,-373,1122,-364,1137,-357,1152,-352,1168,-348,1184,-346,1200,-345,10885,-345,10885,46xm10885,-345l10710,-345,10726,-346,10742,-348,10758,-352,10773,-357,10788,-364,10802,-373,10815,-382,10827,-393,10838,-405,10847,-418,10855,-432,10862,-447,10868,-462,10872,-478,10874,-493,10875,-510,10875,-6060,10874,-6076,10872,-6092,10868,-6108,10862,-6123,10855,-6138,10847,-6151,10838,-6164,10827,-6176,10815,-6187,10802,-6197,10788,-6205,10773,-6212,10758,-6218,10742,-6222,10726,-6224,10710,-6225,10885,-6225,10885,-345xe" filled="true" fillcolor="#000000" stroked="false">
                   <v:path arrowok="t"/>
                   <v:fill opacity="9764f" type="solid"/>
@@ -20608,8 +20608,8 @@
         <w:tabs>
           <w:tab w:pos="387" w:val="left" w:leader="none"/>
         </w:tabs>
-        <w:spacing w:line="297" w:lineRule="auto" w:before="73" w:after="0"/>
-        <w:ind w:left="387" w:right="232" w:hanging="217"/>
+        <w:spacing w:line="240" w:lineRule="auto" w:before="73" w:after="0"/>
+        <w:ind w:left="387" w:right="0" w:hanging="216"/>
         <w:jc w:val="left"/>
         <w:rPr>
           <w:sz w:val="21"/>
@@ -20627,167 +20627,311 @@
         <w:rPr>
           <w:b/>
           <w:color w:val="334054"/>
+          <w:spacing w:val="-2"/>
+          <w:sz w:val="21"/>
+        </w:rPr>
+        <w:t> </w:t>
+      </w:r>
+      <w:r>
+        <w:rPr>
+          <w:b/>
+          <w:color w:val="334054"/>
+          <w:sz w:val="21"/>
+        </w:rPr>
+        <w:t>Verification:</w:t>
+      </w:r>
+      <w:r>
+        <w:rPr>
+          <w:b/>
+          <w:color w:val="334054"/>
+          <w:spacing w:val="-2"/>
+          <w:sz w:val="21"/>
+        </w:rPr>
+        <w:t> </w:t>
+      </w:r>
+      <w:r>
+        <w:rPr>
+          <w:color w:val="334054"/>
+          <w:sz w:val="21"/>
+        </w:rPr>
+        <w:t>Admin</w:t>
+      </w:r>
+      <w:r>
+        <w:rPr>
+          <w:color w:val="334054"/>
+          <w:spacing w:val="-1"/>
+          <w:sz w:val="21"/>
+        </w:rPr>
+        <w:t> </w:t>
+      </w:r>
+      <w:r>
+        <w:rPr>
+          <w:color w:val="334054"/>
+          <w:sz w:val="21"/>
+        </w:rPr>
+        <w:t>inspects</w:t>
+      </w:r>
+      <w:r>
+        <w:rPr>
+          <w:color w:val="334054"/>
+          <w:spacing w:val="-2"/>
+          <w:sz w:val="21"/>
+        </w:rPr>
+        <w:t> </w:t>
+      </w:r>
+      <w:r>
+        <w:rPr>
+          <w:color w:val="334054"/>
+          <w:sz w:val="21"/>
+        </w:rPr>
+        <w:t>the</w:t>
+      </w:r>
+      <w:r>
+        <w:rPr>
+          <w:color w:val="334054"/>
+          <w:spacing w:val="-1"/>
+          <w:sz w:val="21"/>
+        </w:rPr>
+        <w:t> </w:t>
+      </w:r>
+      <w:r>
+        <w:rPr>
+          <w:color w:val="334054"/>
+          <w:sz w:val="21"/>
+        </w:rPr>
+        <w:t>payment</w:t>
+      </w:r>
+      <w:r>
+        <w:rPr>
+          <w:color w:val="334054"/>
+          <w:spacing w:val="-1"/>
+          <w:sz w:val="21"/>
+        </w:rPr>
+        <w:t> </w:t>
+      </w:r>
+      <w:r>
+        <w:rPr>
+          <w:color w:val="334054"/>
+          <w:sz w:val="21"/>
+        </w:rPr>
+        <w:t>proof</w:t>
+      </w:r>
+      <w:r>
+        <w:rPr>
+          <w:color w:val="334054"/>
+          <w:spacing w:val="-1"/>
+          <w:sz w:val="21"/>
+        </w:rPr>
+        <w:t> </w:t>
+      </w:r>
+      <w:r>
+        <w:rPr>
+          <w:color w:val="334054"/>
+          <w:sz w:val="21"/>
+        </w:rPr>
+        <w:t>screenshot</w:t>
+      </w:r>
+      <w:r>
+        <w:rPr>
+          <w:color w:val="334054"/>
+          <w:spacing w:val="-2"/>
+          <w:sz w:val="21"/>
+        </w:rPr>
+        <w:t> </w:t>
+      </w:r>
+      <w:r>
+        <w:rPr>
+          <w:color w:val="334054"/>
+          <w:sz w:val="21"/>
+        </w:rPr>
+        <w:t>in</w:t>
+      </w:r>
+      <w:r>
+        <w:rPr>
+          <w:color w:val="334054"/>
+          <w:spacing w:val="-1"/>
+          <w:sz w:val="21"/>
+        </w:rPr>
+        <w:t> </w:t>
+      </w:r>
+      <w:r>
+        <w:rPr>
+          <w:color w:val="334054"/>
+          <w:sz w:val="21"/>
+        </w:rPr>
+        <w:t>full-resolution</w:t>
+      </w:r>
+      <w:r>
+        <w:rPr>
+          <w:color w:val="334054"/>
+          <w:spacing w:val="-1"/>
+          <w:sz w:val="21"/>
+        </w:rPr>
+        <w:t> </w:t>
+      </w:r>
+      <w:r>
+        <w:rPr>
+          <w:color w:val="334054"/>
+          <w:sz w:val="21"/>
+        </w:rPr>
+        <w:t>lightbox</w:t>
+      </w:r>
+      <w:r>
+        <w:rPr>
+          <w:color w:val="334054"/>
+          <w:spacing w:val="-1"/>
+          <w:sz w:val="21"/>
+        </w:rPr>
+        <w:t> </w:t>
+      </w:r>
+      <w:r>
+        <w:rPr>
+          <w:color w:val="334054"/>
+          <w:spacing w:val="-5"/>
+          <w:sz w:val="21"/>
+        </w:rPr>
+        <w:t>and</w:t>
+      </w:r>
+    </w:p>
+    <w:p>
+      <w:pPr>
+        <w:pStyle w:val="BodyText"/>
+        <w:spacing w:line="283" w:lineRule="auto" w:before="65"/>
+        <w:ind w:left="387" w:right="108"/>
+      </w:pPr>
+      <w:r>
+        <w:rPr>
+          <w:color w:val="334054"/>
+        </w:rPr>
+        <w:t>views</w:t>
+      </w:r>
+      <w:r>
+        <w:rPr>
+          <w:color w:val="334054"/>
           <w:spacing w:val="-4"/>
-          <w:sz w:val="21"/>
-        </w:rPr>
-        <w:t> </w:t>
-      </w:r>
-      <w:r>
-        <w:rPr>
-          <w:b/>
-          <w:color w:val="334054"/>
-          <w:sz w:val="21"/>
-        </w:rPr>
-        <w:t>Verification:</w:t>
-      </w:r>
-      <w:r>
-        <w:rPr>
-          <w:b/>
-          <w:color w:val="334054"/>
-          <w:spacing w:val="-5"/>
-          <w:sz w:val="21"/>
-        </w:rPr>
-        <w:t> </w:t>
-      </w:r>
-      <w:r>
-        <w:rPr>
-          <w:color w:val="334054"/>
-          <w:sz w:val="21"/>
-        </w:rPr>
-        <w:t>Admin</w:t>
+        </w:rPr>
+        <w:t> </w:t>
+      </w:r>
+      <w:r>
+        <w:rPr>
+          <w:color w:val="334054"/>
+        </w:rPr>
+        <w:t>the</w:t>
       </w:r>
       <w:r>
         <w:rPr>
           <w:color w:val="334054"/>
           <w:spacing w:val="-4"/>
-          <w:sz w:val="21"/>
-        </w:rPr>
-        <w:t> </w:t>
-      </w:r>
-      <w:r>
-        <w:rPr>
-          <w:color w:val="334054"/>
-          <w:sz w:val="21"/>
-        </w:rPr>
-        <w:t>inspects</w:t>
+        </w:rPr>
+        <w:t> </w:t>
+      </w:r>
+      <w:r>
+        <w:rPr>
+          <w:color w:val="334054"/>
+        </w:rPr>
+        <w:t>itemized</w:t>
       </w:r>
       <w:r>
         <w:rPr>
           <w:color w:val="334054"/>
           <w:spacing w:val="-4"/>
-          <w:sz w:val="21"/>
-        </w:rPr>
-        <w:t> </w:t>
-      </w:r>
-      <w:r>
-        <w:rPr>
-          <w:color w:val="334054"/>
-          <w:sz w:val="21"/>
-        </w:rPr>
-        <w:t>the</w:t>
+        </w:rPr>
+        <w:t> </w:t>
+      </w:r>
+      <w:r>
+        <w:rPr>
+          <w:color w:val="334054"/>
+        </w:rPr>
+        <w:t>products</w:t>
       </w:r>
       <w:r>
         <w:rPr>
           <w:color w:val="334054"/>
           <w:spacing w:val="-4"/>
-          <w:sz w:val="21"/>
-        </w:rPr>
-        <w:t> </w:t>
-      </w:r>
-      <w:r>
-        <w:rPr>
-          <w:color w:val="334054"/>
-          <w:sz w:val="21"/>
-        </w:rPr>
-        <w:t>payment</w:t>
+        </w:rPr>
+        <w:t> </w:t>
+      </w:r>
+      <w:r>
+        <w:rPr>
+          <w:color w:val="334054"/>
+        </w:rPr>
+        <w:t>breakdown</w:t>
       </w:r>
       <w:r>
         <w:rPr>
           <w:color w:val="334054"/>
           <w:spacing w:val="-4"/>
-          <w:sz w:val="21"/>
-        </w:rPr>
-        <w:t> </w:t>
-      </w:r>
-      <w:r>
-        <w:rPr>
-          <w:color w:val="334054"/>
-          <w:sz w:val="21"/>
-        </w:rPr>
-        <w:t>proof</w:t>
+        </w:rPr>
+        <w:t> </w:t>
+      </w:r>
+      <w:r>
+        <w:rPr>
+          <w:color w:val="334054"/>
+        </w:rPr>
+        <w:t>(product</w:t>
       </w:r>
       <w:r>
         <w:rPr>
           <w:color w:val="334054"/>
           <w:spacing w:val="-4"/>
-          <w:sz w:val="21"/>
-        </w:rPr>
-        <w:t> </w:t>
-      </w:r>
-      <w:r>
-        <w:rPr>
-          <w:color w:val="334054"/>
-          <w:sz w:val="21"/>
-        </w:rPr>
-        <w:t>screenshot</w:t>
+        </w:rPr>
+        <w:t> </w:t>
+      </w:r>
+      <w:r>
+        <w:rPr>
+          <w:color w:val="334054"/>
+        </w:rPr>
+        <w:t>thumbnails,</w:t>
       </w:r>
       <w:r>
         <w:rPr>
           <w:color w:val="334054"/>
           <w:spacing w:val="-4"/>
-          <w:sz w:val="21"/>
-        </w:rPr>
-        <w:t> </w:t>
-      </w:r>
-      <w:r>
-        <w:rPr>
-          <w:color w:val="334054"/>
-          <w:sz w:val="21"/>
-        </w:rPr>
-        <w:t>in</w:t>
+        </w:rPr>
+        <w:t> </w:t>
+      </w:r>
+      <w:r>
+        <w:rPr>
+          <w:color w:val="334054"/>
+        </w:rPr>
+        <w:t>SKUs,</w:t>
       </w:r>
       <w:r>
         <w:rPr>
           <w:color w:val="334054"/>
           <w:spacing w:val="-4"/>
-          <w:sz w:val="21"/>
-        </w:rPr>
-        <w:t> </w:t>
-      </w:r>
-      <w:r>
-        <w:rPr>
-          <w:color w:val="334054"/>
-          <w:sz w:val="21"/>
-        </w:rPr>
-        <w:t>full-resolution</w:t>
+        </w:rPr>
+        <w:t> </w:t>
+      </w:r>
+      <w:r>
+        <w:rPr>
+          <w:color w:val="334054"/>
+        </w:rPr>
+        <w:t>names,</w:t>
       </w:r>
       <w:r>
         <w:rPr>
           <w:color w:val="334054"/>
           <w:spacing w:val="-4"/>
-          <w:sz w:val="21"/>
-        </w:rPr>
-        <w:t> </w:t>
-      </w:r>
-      <w:r>
-        <w:rPr>
-          <w:color w:val="334054"/>
-          <w:sz w:val="21"/>
-        </w:rPr>
-        <w:t>lightbox</w:t>
+        </w:rPr>
+        <w:t> </w:t>
+      </w:r>
+      <w:r>
+        <w:rPr>
+          <w:color w:val="334054"/>
+        </w:rPr>
+        <w:t>quantities,</w:t>
       </w:r>
       <w:r>
         <w:rPr>
           <w:color w:val="334054"/>
           <w:spacing w:val="-4"/>
-          <w:sz w:val="21"/>
-        </w:rPr>
-        <w:t> </w:t>
-      </w:r>
-      <w:r>
-        <w:rPr>
-          <w:color w:val="334054"/>
-          <w:sz w:val="21"/>
+        </w:rPr>
+        <w:t> </w:t>
+      </w:r>
+      <w:r>
+        <w:rPr>
+          <w:color w:val="334054"/>
         </w:rPr>
         <w:t>and</w:t>
       </w:r>
@@ -20795,16 +20939,14 @@
         <w:rPr>
           <w:color w:val="334054"/>
           <w:spacing w:val="-4"/>
-          <w:sz w:val="21"/>
-        </w:rPr>
-        <w:t> </w:t>
-      </w:r>
-      <w:r>
-        <w:rPr>
-          <w:color w:val="334054"/>
-          <w:sz w:val="21"/>
-        </w:rPr>
-        <w:t>1-click approves the transaction.</w:t>
+        </w:rPr>
+        <w:t> </w:t>
+      </w:r>
+      <w:r>
+        <w:rPr>
+          <w:color w:val="334054"/>
+        </w:rPr>
+        <w:t>subtotals) before 1-click approving the transaction.</w:t>
       </w:r>
     </w:p>
     <w:p>
@@ -20817,8 +20959,8 @@
         <w:tabs>
           <w:tab w:pos="387" w:val="left" w:leader="none"/>
         </w:tabs>
-        <w:spacing w:line="283" w:lineRule="auto" w:before="72" w:after="0"/>
-        <w:ind w:left="387" w:right="310" w:hanging="217"/>
+        <w:spacing w:line="240" w:lineRule="auto" w:before="91" w:after="0"/>
+        <w:ind w:left="387" w:right="0" w:hanging="216"/>
         <w:jc w:val="left"/>
         <w:rPr>
           <w:sz w:val="21"/>
@@ -20836,7 +20978,7 @@
         <w:rPr>
           <w:b/>
           <w:color w:val="334054"/>
-          <w:spacing w:val="-4"/>
+          <w:spacing w:val="-1"/>
           <w:sz w:val="21"/>
         </w:rPr>
         <w:t> </w:t>
@@ -20853,7 +20995,24 @@
         <w:rPr>
           <w:b/>
           <w:color w:val="334054"/>
-          <w:spacing w:val="-4"/>
+          <w:spacing w:val="-2"/>
+          <w:sz w:val="21"/>
+        </w:rPr>
+        <w:t> </w:t>
+      </w:r>
+      <w:r>
+        <w:rPr>
+          <w:b/>
+          <w:color w:val="334054"/>
+          <w:sz w:val="21"/>
+        </w:rPr>
+        <w:t>Itemized</w:t>
+      </w:r>
+      <w:r>
+        <w:rPr>
+          <w:b/>
+          <w:color w:val="334054"/>
+          <w:spacing w:val="-1"/>
           <w:sz w:val="21"/>
         </w:rPr>
         <w:t> </w:t>
@@ -20870,7 +21029,7 @@
         <w:rPr>
           <w:b/>
           <w:color w:val="334054"/>
-          <w:spacing w:val="-5"/>
+          <w:spacing w:val="-2"/>
           <w:sz w:val="21"/>
         </w:rPr>
         <w:t> </w:t>
@@ -20885,7 +21044,7 @@
       <w:r>
         <w:rPr>
           <w:color w:val="334054"/>
-          <w:spacing w:val="-4"/>
+          <w:spacing w:val="-1"/>
           <w:sz w:val="21"/>
         </w:rPr>
         <w:t> </w:t>
@@ -20900,7 +21059,7 @@
       <w:r>
         <w:rPr>
           <w:color w:val="334054"/>
-          <w:spacing w:val="-4"/>
+          <w:spacing w:val="-1"/>
           <w:sz w:val="21"/>
         </w:rPr>
         <w:t> </w:t>
@@ -20915,7 +21074,7 @@
       <w:r>
         <w:rPr>
           <w:color w:val="334054"/>
-          <w:spacing w:val="-4"/>
+          <w:spacing w:val="-1"/>
           <w:sz w:val="21"/>
         </w:rPr>
         <w:t> </w:t>
@@ -20930,7 +21089,7 @@
       <w:r>
         <w:rPr>
           <w:color w:val="334054"/>
-          <w:spacing w:val="-4"/>
+          <w:spacing w:val="-1"/>
           <w:sz w:val="21"/>
         </w:rPr>
         <w:t> </w:t>
@@ -20947,7 +21106,7 @@
         <w:rPr>
           <w:i/>
           <w:color w:val="334054"/>
-          <w:spacing w:val="-5"/>
+          <w:spacing w:val="-1"/>
           <w:sz w:val="21"/>
         </w:rPr>
         <w:t> </w:t>
@@ -20962,7 +21121,7 @@
       <w:r>
         <w:rPr>
           <w:color w:val="334054"/>
-          <w:spacing w:val="-4"/>
+          <w:spacing w:val="-2"/>
           <w:sz w:val="21"/>
         </w:rPr>
         <w:t> </w:t>
@@ -20979,7 +21138,7 @@
         <w:rPr>
           <w:i/>
           <w:color w:val="334054"/>
-          <w:spacing w:val="-5"/>
+          <w:spacing w:val="-1"/>
           <w:sz w:val="21"/>
         </w:rPr>
         <w:t> </w:t>
@@ -20994,7 +21153,7 @@
       <w:r>
         <w:rPr>
           <w:color w:val="334054"/>
-          <w:spacing w:val="-4"/>
+          <w:spacing w:val="-1"/>
           <w:sz w:val="21"/>
         </w:rPr>
         <w:t> </w:t>
@@ -21003,6 +21162,7 @@
         <w:rPr>
           <w:i/>
           <w:color w:val="334054"/>
+          <w:spacing w:val="-2"/>
           <w:sz w:val="21"/>
         </w:rPr>
         <w:t>Completed</w:t>
@@ -21010,35 +21170,185 @@
       <w:r>
         <w:rPr>
           <w:color w:val="334054"/>
+          <w:spacing w:val="-2"/>
           <w:sz w:val="21"/>
         </w:rPr>
         <w:t>.</w:t>
       </w:r>
-      <w:r>
-        <w:rPr>
-          <w:color w:val="334054"/>
-          <w:spacing w:val="-4"/>
-          <w:sz w:val="21"/>
-        </w:rPr>
-        <w:t> </w:t>
-      </w:r>
-      <w:r>
-        <w:rPr>
-          <w:color w:val="334054"/>
-          <w:sz w:val="21"/>
-        </w:rPr>
-        <w:t>Scannable corporate tax invoices are generated for customer verification.</w:t>
-      </w:r>
     </w:p>
     <w:p>
       <w:pPr>
         <w:pStyle w:val="BodyText"/>
-      </w:pPr>
+        <w:spacing w:line="283" w:lineRule="auto" w:before="66"/>
+        <w:ind w:left="387"/>
+      </w:pPr>
+      <w:r>
+        <w:rPr>
+          <w:color w:val="334054"/>
+        </w:rPr>
+        <w:t>Scannable</w:t>
+      </w:r>
+      <w:r>
+        <w:rPr>
+          <w:color w:val="334054"/>
+          <w:spacing w:val="-3"/>
+        </w:rPr>
+        <w:t> </w:t>
+      </w:r>
+      <w:r>
+        <w:rPr>
+          <w:color w:val="334054"/>
+        </w:rPr>
+        <w:t>corporate</w:t>
+      </w:r>
+      <w:r>
+        <w:rPr>
+          <w:color w:val="334054"/>
+          <w:spacing w:val="-3"/>
+        </w:rPr>
+        <w:t> </w:t>
+      </w:r>
+      <w:r>
+        <w:rPr>
+          <w:color w:val="334054"/>
+        </w:rPr>
+        <w:t>tax</w:t>
+      </w:r>
+      <w:r>
+        <w:rPr>
+          <w:color w:val="334054"/>
+          <w:spacing w:val="-3"/>
+        </w:rPr>
+        <w:t> </w:t>
+      </w:r>
+      <w:r>
+        <w:rPr>
+          <w:color w:val="334054"/>
+        </w:rPr>
+        <w:t>invoices</w:t>
+      </w:r>
+      <w:r>
+        <w:rPr>
+          <w:color w:val="334054"/>
+          <w:spacing w:val="-3"/>
+        </w:rPr>
+        <w:t> </w:t>
+      </w:r>
+      <w:r>
+        <w:rPr>
+          <w:color w:val="334054"/>
+        </w:rPr>
+        <w:t>with</w:t>
+      </w:r>
+      <w:r>
+        <w:rPr>
+          <w:color w:val="334054"/>
+          <w:spacing w:val="-3"/>
+        </w:rPr>
+        <w:t> </w:t>
+      </w:r>
+      <w:r>
+        <w:rPr>
+          <w:color w:val="334054"/>
+        </w:rPr>
+        <w:t>dynamic</w:t>
+      </w:r>
+      <w:r>
+        <w:rPr>
+          <w:color w:val="334054"/>
+          <w:spacing w:val="-3"/>
+        </w:rPr>
+        <w:t> </w:t>
+      </w:r>
+      <w:r>
+        <w:rPr>
+          <w:color w:val="334054"/>
+        </w:rPr>
+        <w:t>itemized</w:t>
+      </w:r>
+      <w:r>
+        <w:rPr>
+          <w:color w:val="334054"/>
+          <w:spacing w:val="-3"/>
+        </w:rPr>
+        <w:t> </w:t>
+      </w:r>
+      <w:r>
+        <w:rPr>
+          <w:color w:val="334054"/>
+        </w:rPr>
+        <w:t>product</w:t>
+      </w:r>
+      <w:r>
+        <w:rPr>
+          <w:color w:val="334054"/>
+          <w:spacing w:val="-3"/>
+        </w:rPr>
+        <w:t> </w:t>
+      </w:r>
+      <w:r>
+        <w:rPr>
+          <w:color w:val="334054"/>
+        </w:rPr>
+        <w:t>tables,</w:t>
+      </w:r>
+      <w:r>
+        <w:rPr>
+          <w:color w:val="334054"/>
+          <w:spacing w:val="-3"/>
+        </w:rPr>
+        <w:t> </w:t>
+      </w:r>
+      <w:r>
+        <w:rPr>
+          <w:color w:val="334054"/>
+        </w:rPr>
+        <w:t>digital</w:t>
+      </w:r>
+      <w:r>
+        <w:rPr>
+          <w:color w:val="334054"/>
+          <w:spacing w:val="-3"/>
+        </w:rPr>
+        <w:t> </w:t>
+      </w:r>
+      <w:r>
+        <w:rPr>
+          <w:color w:val="334054"/>
+        </w:rPr>
+        <w:t>QR</w:t>
+      </w:r>
+      <w:r>
+        <w:rPr>
+          <w:color w:val="334054"/>
+          <w:spacing w:val="-3"/>
+        </w:rPr>
+        <w:t> </w:t>
+      </w:r>
+      <w:r>
+        <w:rPr>
+          <w:color w:val="334054"/>
+        </w:rPr>
+        <w:t>verification</w:t>
+      </w:r>
+      <w:r>
+        <w:rPr>
+          <w:color w:val="334054"/>
+          <w:spacing w:val="-3"/>
+        </w:rPr>
+        <w:t> </w:t>
+      </w:r>
+      <w:r>
+        <w:rPr>
+          <w:color w:val="334054"/>
+        </w:rPr>
+        <w:t>codes, and cashier officer signatures are generated for customer and accounting verification.</w:t>
+      </w:r>
     </w:p>
     <w:p>
       <w:pPr>
         <w:pStyle w:val="BodyText"/>
-        <w:spacing w:before="13"/>
+        <w:spacing w:before="277"/>
       </w:pPr>
     </w:p>
     <w:p>
@@ -21051,7 +21361,7 @@
         <w:tabs>
           <w:tab w:pos="385" w:val="left" w:leader="none"/>
         </w:tabs>
-        <w:spacing w:line="240" w:lineRule="auto" w:before="0" w:after="0"/>
+        <w:spacing w:line="240" w:lineRule="auto" w:before="1" w:after="0"/>
         <w:ind w:left="385" w:right="0" w:hanging="358"/>
         <w:jc w:val="left"/>
       </w:pPr>
@@ -21157,16 +21467,15 @@
     <w:p>
       <w:pPr>
         <w:pStyle w:val="BodyText"/>
-        <w:spacing w:before="13"/>
-        <w:rPr>
-          <w:b/>
-          <w:sz w:val="7"/>
-        </w:rPr>
-      </w:pPr>
-      <w:r>
-        <w:rPr>
-          <w:b/>
-          <w:sz w:val="7"/>
+        <w:rPr>
+          <w:b/>
+          <w:sz w:val="9"/>
+        </w:rPr>
+      </w:pPr>
+      <w:r>
+        <w:rPr>
+          <w:b/>
+          <w:sz w:val="9"/>
         </w:rPr>
         <mc:AlternateContent>
           <mc:Choice Requires="wps">
@@ -21177,7 +21486,7 @@
                   <wp:posOffset>647700</wp:posOffset>
                 </wp:positionH>
                 <wp:positionV relativeFrom="paragraph">
-                  <wp:posOffset>82745</wp:posOffset>
+                  <wp:posOffset>91763</wp:posOffset>
                 </wp:positionV>
                 <wp:extent cx="6264275" cy="9525"/>
                 <wp:effectExtent l="0" t="0" r="0" b="0"/>
@@ -21241,7 +21550,7 @@
           </mc:Choice>
           <mc:Fallback>
             <w:pict>
-              <v:rect style="position:absolute;margin-left:51.000004pt;margin-top:6.515421pt;width:493.230444pt;height:.75pt;mso-position-horizontal-relative:page;mso-position-vertical-relative:paragraph;z-index:-15725056;mso-wrap-distance-left:0;mso-wrap-distance-right:0" id="docshape47" filled="true" fillcolor="#cbd5e1" stroked="false">
+              <v:rect style="position:absolute;margin-left:51.000004pt;margin-top:7.225495pt;width:493.230444pt;height:.75pt;mso-position-horizontal-relative:page;mso-position-vertical-relative:paragraph;z-index:-15725056;mso-wrap-distance-left:0;mso-wrap-distance-right:0" id="docshape47" filled="true" fillcolor="#cbd5e1" stroked="false">
                 <v:fill type="solid"/>
                 <w10:wrap type="topAndBottom"/>
               </v:rect>
@@ -21253,7 +21562,7 @@
     <w:p>
       <w:pPr>
         <w:pStyle w:val="BodyText"/>
-        <w:spacing w:before="283"/>
+        <w:spacing w:before="268"/>
         <w:ind w:left="27"/>
       </w:pPr>
       <w:r>
@@ -21273,7 +21582,7 @@
     <w:p>
       <w:pPr>
         <w:pStyle w:val="BodyText"/>
-        <w:spacing w:before="11"/>
+        <w:spacing w:before="26"/>
       </w:pPr>
     </w:p>
     <w:p>
@@ -21459,215 +21768,11 @@
     <w:p>
       <w:pPr>
         <w:pStyle w:val="ListParagraph"/>
-        <w:numPr>
-          <w:ilvl w:val="0"/>
-          <w:numId w:val="5"/>
-        </w:numPr>
-        <w:tabs>
-          <w:tab w:pos="387" w:val="left" w:leader="none"/>
-        </w:tabs>
-        <w:spacing w:line="240" w:lineRule="auto" w:before="88" w:after="0"/>
-        <w:ind w:left="387" w:right="0" w:hanging="255"/>
+        <w:spacing w:after="0" w:line="297" w:lineRule="auto"/>
         <w:jc w:val="left"/>
         <w:rPr>
           <w:sz w:val="21"/>
         </w:rPr>
-      </w:pPr>
-      <w:r>
-        <w:rPr>
-          <w:b/>
-          <w:color w:val="334054"/>
-          <w:sz w:val="21"/>
-        </w:rPr>
-        <w:t>Session</w:t>
-      </w:r>
-      <w:r>
-        <w:rPr>
-          <w:b/>
-          <w:color w:val="334054"/>
-          <w:spacing w:val="-3"/>
-          <w:sz w:val="21"/>
-        </w:rPr>
-        <w:t> </w:t>
-      </w:r>
-      <w:r>
-        <w:rPr>
-          <w:b/>
-          <w:color w:val="334054"/>
-          <w:sz w:val="21"/>
-        </w:rPr>
-        <w:t>2</w:t>
-      </w:r>
-      <w:r>
-        <w:rPr>
-          <w:b/>
-          <w:color w:val="334054"/>
-          <w:spacing w:val="-1"/>
-          <w:sz w:val="21"/>
-        </w:rPr>
-        <w:t> </w:t>
-      </w:r>
-      <w:r>
-        <w:rPr>
-          <w:b/>
-          <w:color w:val="334054"/>
-          <w:sz w:val="21"/>
-        </w:rPr>
-        <w:t>(Database</w:t>
-      </w:r>
-      <w:r>
-        <w:rPr>
-          <w:b/>
-          <w:color w:val="334054"/>
-          <w:spacing w:val="-2"/>
-          <w:sz w:val="21"/>
-        </w:rPr>
-        <w:t> </w:t>
-      </w:r>
-      <w:r>
-        <w:rPr>
-          <w:b/>
-          <w:color w:val="334054"/>
-          <w:sz w:val="21"/>
-        </w:rPr>
-        <w:t>Schema</w:t>
-      </w:r>
-      <w:r>
-        <w:rPr>
-          <w:b/>
-          <w:color w:val="334054"/>
-          <w:spacing w:val="-1"/>
-          <w:sz w:val="21"/>
-        </w:rPr>
-        <w:t> </w:t>
-      </w:r>
-      <w:r>
-        <w:rPr>
-          <w:b/>
-          <w:color w:val="334054"/>
-          <w:sz w:val="21"/>
-        </w:rPr>
-        <w:t>&amp;</w:t>
-      </w:r>
-      <w:r>
-        <w:rPr>
-          <w:b/>
-          <w:color w:val="334054"/>
-          <w:spacing w:val="-1"/>
-          <w:sz w:val="21"/>
-        </w:rPr>
-        <w:t> </w:t>
-      </w:r>
-      <w:r>
-        <w:rPr>
-          <w:b/>
-          <w:color w:val="334054"/>
-          <w:sz w:val="21"/>
-        </w:rPr>
-        <w:t>Scaffolding):</w:t>
-      </w:r>
-      <w:r>
-        <w:rPr>
-          <w:b/>
-          <w:color w:val="334054"/>
-          <w:spacing w:val="-2"/>
-          <w:sz w:val="21"/>
-        </w:rPr>
-        <w:t> </w:t>
-      </w:r>
-      <w:r>
-        <w:rPr>
-          <w:color w:val="334054"/>
-          <w:sz w:val="21"/>
-        </w:rPr>
-        <w:t>Initialized Next.js</w:t>
-      </w:r>
-      <w:r>
-        <w:rPr>
-          <w:color w:val="334054"/>
-          <w:spacing w:val="-1"/>
-          <w:sz w:val="21"/>
-        </w:rPr>
-        <w:t> </w:t>
-      </w:r>
-      <w:r>
-        <w:rPr>
-          <w:color w:val="334054"/>
-          <w:sz w:val="21"/>
-        </w:rPr>
-        <w:t>App</w:t>
-      </w:r>
-      <w:r>
-        <w:rPr>
-          <w:color w:val="334054"/>
-          <w:spacing w:val="-1"/>
-          <w:sz w:val="21"/>
-        </w:rPr>
-        <w:t> </w:t>
-      </w:r>
-      <w:r>
-        <w:rPr>
-          <w:color w:val="334054"/>
-          <w:sz w:val="21"/>
-        </w:rPr>
-        <w:t>Router,</w:t>
-      </w:r>
-      <w:r>
-        <w:rPr>
-          <w:color w:val="334054"/>
-          <w:spacing w:val="-1"/>
-          <w:sz w:val="21"/>
-        </w:rPr>
-        <w:t> </w:t>
-      </w:r>
-      <w:r>
-        <w:rPr>
-          <w:color w:val="334054"/>
-          <w:spacing w:val="-2"/>
-          <w:sz w:val="21"/>
-        </w:rPr>
-        <w:t>created</w:t>
-      </w:r>
-    </w:p>
-    <w:p>
-      <w:pPr>
-        <w:pStyle w:val="BodyText"/>
-        <w:spacing w:before="50"/>
-        <w:ind w:left="387"/>
-      </w:pPr>
-      <w:r>
-        <w:rPr>
-          <w:rFonts w:ascii="Consolas"/>
-          <w:color w:val="334054"/>
-        </w:rPr>
-        <w:t>supabase/schema.sql</w:t>
-      </w:r>
-      <w:r>
-        <w:rPr>
-          <w:rFonts w:ascii="Consolas"/>
-          <w:color w:val="334054"/>
-          <w:spacing w:val="-58"/>
-        </w:rPr>
-        <w:t> </w:t>
-      </w:r>
-      <w:r>
-        <w:rPr>
-          <w:color w:val="334054"/>
-        </w:rPr>
-        <w:t>with RLS policies, and wrote preliminary </w:t>
-      </w:r>
-      <w:r>
-        <w:rPr>
-          <w:color w:val="334054"/>
-          <w:spacing w:val="-2"/>
-        </w:rPr>
-        <w:t>documentation.</w:t>
-      </w:r>
-    </w:p>
-    <w:p>
-      <w:pPr>
-        <w:pStyle w:val="BodyText"/>
-        <w:spacing w:after="0"/>
         <w:sectPr>
           <w:pgSz w:w="11900" w:h="16840"/>
           <w:pgMar w:top="1000" w:bottom="280" w:left="992" w:right="992"/>
@@ -21684,7 +21789,215 @@
         <w:tabs>
           <w:tab w:pos="387" w:val="left" w:leader="none"/>
         </w:tabs>
-        <w:spacing w:line="283" w:lineRule="auto" w:before="75" w:after="0"/>
+        <w:spacing w:line="240" w:lineRule="auto" w:before="75" w:after="0"/>
+        <w:ind w:left="387" w:right="0" w:hanging="255"/>
+        <w:jc w:val="left"/>
+        <w:rPr>
+          <w:sz w:val="21"/>
+        </w:rPr>
+      </w:pPr>
+      <w:r>
+        <w:rPr>
+          <w:b/>
+          <w:color w:val="334054"/>
+          <w:sz w:val="21"/>
+        </w:rPr>
+        <w:t>Session</w:t>
+      </w:r>
+      <w:r>
+        <w:rPr>
+          <w:b/>
+          <w:color w:val="334054"/>
+          <w:spacing w:val="-3"/>
+          <w:sz w:val="21"/>
+        </w:rPr>
+        <w:t> </w:t>
+      </w:r>
+      <w:r>
+        <w:rPr>
+          <w:b/>
+          <w:color w:val="334054"/>
+          <w:sz w:val="21"/>
+        </w:rPr>
+        <w:t>2</w:t>
+      </w:r>
+      <w:r>
+        <w:rPr>
+          <w:b/>
+          <w:color w:val="334054"/>
+          <w:spacing w:val="-1"/>
+          <w:sz w:val="21"/>
+        </w:rPr>
+        <w:t> </w:t>
+      </w:r>
+      <w:r>
+        <w:rPr>
+          <w:b/>
+          <w:color w:val="334054"/>
+          <w:sz w:val="21"/>
+        </w:rPr>
+        <w:t>(Database</w:t>
+      </w:r>
+      <w:r>
+        <w:rPr>
+          <w:b/>
+          <w:color w:val="334054"/>
+          <w:spacing w:val="-2"/>
+          <w:sz w:val="21"/>
+        </w:rPr>
+        <w:t> </w:t>
+      </w:r>
+      <w:r>
+        <w:rPr>
+          <w:b/>
+          <w:color w:val="334054"/>
+          <w:sz w:val="21"/>
+        </w:rPr>
+        <w:t>Schema</w:t>
+      </w:r>
+      <w:r>
+        <w:rPr>
+          <w:b/>
+          <w:color w:val="334054"/>
+          <w:spacing w:val="-1"/>
+          <w:sz w:val="21"/>
+        </w:rPr>
+        <w:t> </w:t>
+      </w:r>
+      <w:r>
+        <w:rPr>
+          <w:b/>
+          <w:color w:val="334054"/>
+          <w:sz w:val="21"/>
+        </w:rPr>
+        <w:t>&amp;</w:t>
+      </w:r>
+      <w:r>
+        <w:rPr>
+          <w:b/>
+          <w:color w:val="334054"/>
+          <w:spacing w:val="-1"/>
+          <w:sz w:val="21"/>
+        </w:rPr>
+        <w:t> </w:t>
+      </w:r>
+      <w:r>
+        <w:rPr>
+          <w:b/>
+          <w:color w:val="334054"/>
+          <w:sz w:val="21"/>
+        </w:rPr>
+        <w:t>Scaffolding):</w:t>
+      </w:r>
+      <w:r>
+        <w:rPr>
+          <w:b/>
+          <w:color w:val="334054"/>
+          <w:spacing w:val="-2"/>
+          <w:sz w:val="21"/>
+        </w:rPr>
+        <w:t> </w:t>
+      </w:r>
+      <w:r>
+        <w:rPr>
+          <w:color w:val="334054"/>
+          <w:sz w:val="21"/>
+        </w:rPr>
+        <w:t>Initialized Next.js</w:t>
+      </w:r>
+      <w:r>
+        <w:rPr>
+          <w:color w:val="334054"/>
+          <w:spacing w:val="-1"/>
+          <w:sz w:val="21"/>
+        </w:rPr>
+        <w:t> </w:t>
+      </w:r>
+      <w:r>
+        <w:rPr>
+          <w:color w:val="334054"/>
+          <w:sz w:val="21"/>
+        </w:rPr>
+        <w:t>App</w:t>
+      </w:r>
+      <w:r>
+        <w:rPr>
+          <w:color w:val="334054"/>
+          <w:spacing w:val="-1"/>
+          <w:sz w:val="21"/>
+        </w:rPr>
+        <w:t> </w:t>
+      </w:r>
+      <w:r>
+        <w:rPr>
+          <w:color w:val="334054"/>
+          <w:sz w:val="21"/>
+        </w:rPr>
+        <w:t>Router,</w:t>
+      </w:r>
+      <w:r>
+        <w:rPr>
+          <w:color w:val="334054"/>
+          <w:spacing w:val="-1"/>
+          <w:sz w:val="21"/>
+        </w:rPr>
+        <w:t> </w:t>
+      </w:r>
+      <w:r>
+        <w:rPr>
+          <w:color w:val="334054"/>
+          <w:spacing w:val="-2"/>
+          <w:sz w:val="21"/>
+        </w:rPr>
+        <w:t>created</w:t>
+      </w:r>
+    </w:p>
+    <w:p>
+      <w:pPr>
+        <w:pStyle w:val="BodyText"/>
+        <w:spacing w:before="50"/>
+        <w:ind w:left="387"/>
+      </w:pPr>
+      <w:r>
+        <w:rPr>
+          <w:rFonts w:ascii="Consolas"/>
+          <w:color w:val="334054"/>
+        </w:rPr>
+        <w:t>supabase/schema.sql</w:t>
+      </w:r>
+      <w:r>
+        <w:rPr>
+          <w:rFonts w:ascii="Consolas"/>
+          <w:color w:val="334054"/>
+          <w:spacing w:val="-58"/>
+        </w:rPr>
+        <w:t> </w:t>
+      </w:r>
+      <w:r>
+        <w:rPr>
+          <w:color w:val="334054"/>
+        </w:rPr>
+        <w:t>with RLS policies, and wrote preliminary </w:t>
+      </w:r>
+      <w:r>
+        <w:rPr>
+          <w:color w:val="334054"/>
+          <w:spacing w:val="-2"/>
+        </w:rPr>
+        <w:t>documentation.</w:t>
+      </w:r>
+    </w:p>
+    <w:p>
+      <w:pPr>
+        <w:pStyle w:val="ListParagraph"/>
+        <w:numPr>
+          <w:ilvl w:val="0"/>
+          <w:numId w:val="5"/>
+        </w:numPr>
+        <w:tabs>
+          <w:tab w:pos="387" w:val="left" w:leader="none"/>
+        </w:tabs>
+        <w:spacing w:line="283" w:lineRule="auto" w:before="171" w:after="0"/>
         <w:ind w:left="387" w:right="228" w:hanging="255"/>
         <w:jc w:val="left"/>
         <w:rPr>
@@ -22080,7 +22393,7 @@
     <w:p>
       <w:pPr>
         <w:pStyle w:val="BodyText"/>
-        <w:spacing w:before="65"/>
+        <w:spacing w:before="66"/>
         <w:ind w:left="387"/>
       </w:pPr>
       <w:r>
@@ -22107,7 +22420,7 @@
         <w:tabs>
           <w:tab w:pos="387" w:val="left" w:leader="none"/>
         </w:tabs>
-        <w:spacing w:line="240" w:lineRule="auto" w:before="156" w:after="0"/>
+        <w:spacing w:line="240" w:lineRule="auto" w:before="140" w:after="0"/>
         <w:ind w:left="387" w:right="0" w:hanging="255"/>
         <w:jc w:val="left"/>
         <w:rPr>
@@ -22216,7 +22529,7 @@
     <w:p>
       <w:pPr>
         <w:pStyle w:val="BodyText"/>
-        <w:spacing w:line="297" w:lineRule="auto" w:before="66"/>
+        <w:spacing w:line="297" w:lineRule="auto" w:before="81"/>
         <w:ind w:left="387"/>
       </w:pPr>
       <w:r>
@@ -22448,7 +22761,7 @@
     <w:p>
       <w:pPr>
         <w:pStyle w:val="BodyText"/>
-        <w:spacing w:line="297" w:lineRule="auto" w:before="66"/>
+        <w:spacing w:line="283" w:lineRule="auto" w:before="66"/>
         <w:ind w:left="387" w:right="108"/>
       </w:pPr>
       <w:r>
@@ -22624,7 +22937,7 @@
         <w:tabs>
           <w:tab w:pos="387" w:val="left" w:leader="none"/>
         </w:tabs>
-        <w:spacing w:line="283" w:lineRule="auto" w:before="72" w:after="0"/>
+        <w:spacing w:line="283" w:lineRule="auto" w:before="106" w:after="0"/>
         <w:ind w:left="387" w:right="537" w:hanging="255"/>
         <w:jc w:val="left"/>
         <w:rPr>
@@ -22814,6 +23127,326 @@
           <w:sz w:val="21"/>
         </w:rPr>
         <w:t>Safari, Firefox), sleek dark scrollbars, backdrop blur fallbacks, and 1-click interactive database seeder.</w:t>
+      </w:r>
+    </w:p>
+    <w:p>
+      <w:pPr>
+        <w:pStyle w:val="ListParagraph"/>
+        <w:numPr>
+          <w:ilvl w:val="0"/>
+          <w:numId w:val="5"/>
+        </w:numPr>
+        <w:tabs>
+          <w:tab w:pos="387" w:val="left" w:leader="none"/>
+        </w:tabs>
+        <w:spacing w:line="240" w:lineRule="auto" w:before="91" w:after="0"/>
+        <w:ind w:left="387" w:right="0" w:hanging="255"/>
+        <w:jc w:val="left"/>
+        <w:rPr>
+          <w:sz w:val="21"/>
+        </w:rPr>
+      </w:pPr>
+      <w:r>
+        <w:rPr>
+          <w:b/>
+          <w:color w:val="334054"/>
+          <w:sz w:val="21"/>
+        </w:rPr>
+        <w:t>Session</w:t>
+      </w:r>
+      <w:r>
+        <w:rPr>
+          <w:b/>
+          <w:color w:val="334054"/>
+          <w:spacing w:val="-2"/>
+          <w:sz w:val="21"/>
+        </w:rPr>
+        <w:t> </w:t>
+      </w:r>
+      <w:r>
+        <w:rPr>
+          <w:b/>
+          <w:color w:val="334054"/>
+          <w:sz w:val="21"/>
+        </w:rPr>
+        <w:t>8</w:t>
+      </w:r>
+      <w:r>
+        <w:rPr>
+          <w:b/>
+          <w:color w:val="334054"/>
+          <w:spacing w:val="-1"/>
+          <w:sz w:val="21"/>
+        </w:rPr>
+        <w:t> </w:t>
+      </w:r>
+      <w:r>
+        <w:rPr>
+          <w:b/>
+          <w:color w:val="334054"/>
+          <w:sz w:val="21"/>
+        </w:rPr>
+        <w:t>(Single-Merchant</w:t>
+      </w:r>
+      <w:r>
+        <w:rPr>
+          <w:b/>
+          <w:color w:val="334054"/>
+          <w:spacing w:val="-1"/>
+          <w:sz w:val="21"/>
+        </w:rPr>
+        <w:t> </w:t>
+      </w:r>
+      <w:r>
+        <w:rPr>
+          <w:b/>
+          <w:color w:val="334054"/>
+          <w:sz w:val="21"/>
+        </w:rPr>
+        <w:t>Architecture</w:t>
+      </w:r>
+      <w:r>
+        <w:rPr>
+          <w:b/>
+          <w:color w:val="334054"/>
+          <w:spacing w:val="-1"/>
+          <w:sz w:val="21"/>
+        </w:rPr>
+        <w:t> </w:t>
+      </w:r>
+      <w:r>
+        <w:rPr>
+          <w:b/>
+          <w:color w:val="334054"/>
+          <w:sz w:val="21"/>
+        </w:rPr>
+        <w:t>&amp;</w:t>
+      </w:r>
+      <w:r>
+        <w:rPr>
+          <w:b/>
+          <w:color w:val="334054"/>
+          <w:spacing w:val="-1"/>
+          <w:sz w:val="21"/>
+        </w:rPr>
+        <w:t> </w:t>
+      </w:r>
+      <w:r>
+        <w:rPr>
+          <w:b/>
+          <w:color w:val="334054"/>
+          <w:sz w:val="21"/>
+        </w:rPr>
+        <w:t>Final</w:t>
+      </w:r>
+      <w:r>
+        <w:rPr>
+          <w:b/>
+          <w:color w:val="334054"/>
+          <w:spacing w:val="-1"/>
+          <w:sz w:val="21"/>
+        </w:rPr>
+        <w:t> </w:t>
+      </w:r>
+      <w:r>
+        <w:rPr>
+          <w:b/>
+          <w:color w:val="334054"/>
+          <w:sz w:val="21"/>
+        </w:rPr>
+        <w:t>Submission):</w:t>
+      </w:r>
+      <w:r>
+        <w:rPr>
+          <w:b/>
+          <w:color w:val="334054"/>
+          <w:spacing w:val="-2"/>
+          <w:sz w:val="21"/>
+        </w:rPr>
+        <w:t> </w:t>
+      </w:r>
+      <w:r>
+        <w:rPr>
+          <w:color w:val="334054"/>
+          <w:sz w:val="21"/>
+        </w:rPr>
+        <w:t>Streamlined</w:t>
+      </w:r>
+      <w:r>
+        <w:rPr>
+          <w:color w:val="334054"/>
+          <w:spacing w:val="-1"/>
+          <w:sz w:val="21"/>
+        </w:rPr>
+        <w:t> </w:t>
+      </w:r>
+      <w:r>
+        <w:rPr>
+          <w:color w:val="334054"/>
+          <w:sz w:val="21"/>
+        </w:rPr>
+        <w:t>architecture</w:t>
+      </w:r>
+      <w:r>
+        <w:rPr>
+          <w:color w:val="334054"/>
+          <w:spacing w:val="-1"/>
+          <w:sz w:val="21"/>
+        </w:rPr>
+        <w:t> </w:t>
+      </w:r>
+      <w:r>
+        <w:rPr>
+          <w:color w:val="334054"/>
+          <w:sz w:val="21"/>
+        </w:rPr>
+        <w:t>to</w:t>
+      </w:r>
+      <w:r>
+        <w:rPr>
+          <w:color w:val="334054"/>
+          <w:spacing w:val="-1"/>
+          <w:sz w:val="21"/>
+        </w:rPr>
+        <w:t> </w:t>
+      </w:r>
+      <w:r>
+        <w:rPr>
+          <w:color w:val="334054"/>
+          <w:spacing w:val="-4"/>
+          <w:sz w:val="21"/>
+        </w:rPr>
+        <w:t>pure</w:t>
+      </w:r>
+    </w:p>
+    <w:p>
+      <w:pPr>
+        <w:pStyle w:val="BodyText"/>
+        <w:spacing w:line="283" w:lineRule="auto" w:before="65"/>
+        <w:ind w:left="387"/>
+      </w:pPr>
+      <w:r>
+        <w:rPr>
+          <w:color w:val="334054"/>
+        </w:rPr>
+        <w:t>single-merchant</w:t>
+      </w:r>
+      <w:r>
+        <w:rPr>
+          <w:color w:val="334054"/>
+          <w:spacing w:val="-4"/>
+        </w:rPr>
+        <w:t> </w:t>
+      </w:r>
+      <w:r>
+        <w:rPr>
+          <w:color w:val="334054"/>
+        </w:rPr>
+        <w:t>operations,</w:t>
+      </w:r>
+      <w:r>
+        <w:rPr>
+          <w:color w:val="334054"/>
+          <w:spacing w:val="-4"/>
+        </w:rPr>
+        <w:t> </w:t>
+      </w:r>
+      <w:r>
+        <w:rPr>
+          <w:color w:val="334054"/>
+        </w:rPr>
+        <w:t>removed</w:t>
+      </w:r>
+      <w:r>
+        <w:rPr>
+          <w:color w:val="334054"/>
+          <w:spacing w:val="-4"/>
+        </w:rPr>
+        <w:t> </w:t>
+      </w:r>
+      <w:r>
+        <w:rPr>
+          <w:color w:val="334054"/>
+        </w:rPr>
+        <w:t>registration</w:t>
+      </w:r>
+      <w:r>
+        <w:rPr>
+          <w:color w:val="334054"/>
+          <w:spacing w:val="-4"/>
+        </w:rPr>
+        <w:t> </w:t>
+      </w:r>
+      <w:r>
+        <w:rPr>
+          <w:color w:val="334054"/>
+        </w:rPr>
+        <w:t>confusion,</w:t>
+      </w:r>
+      <w:r>
+        <w:rPr>
+          <w:color w:val="334054"/>
+          <w:spacing w:val="-4"/>
+        </w:rPr>
+        <w:t> </w:t>
+      </w:r>
+      <w:r>
+        <w:rPr>
+          <w:color w:val="334054"/>
+        </w:rPr>
+        <w:t>added</w:t>
+      </w:r>
+      <w:r>
+        <w:rPr>
+          <w:color w:val="334054"/>
+          <w:spacing w:val="-4"/>
+        </w:rPr>
+        <w:t> </w:t>
+      </w:r>
+      <w:r>
+        <w:rPr>
+          <w:color w:val="334054"/>
+        </w:rPr>
+        <w:t>QRIS</w:t>
+      </w:r>
+      <w:r>
+        <w:rPr>
+          <w:color w:val="334054"/>
+          <w:spacing w:val="-4"/>
+        </w:rPr>
+        <w:t> </w:t>
+      </w:r>
+      <w:r>
+        <w:rPr>
+          <w:color w:val="334054"/>
+        </w:rPr>
+        <w:t>screenshot</w:t>
+      </w:r>
+      <w:r>
+        <w:rPr>
+          <w:color w:val="334054"/>
+          <w:spacing w:val="-4"/>
+        </w:rPr>
+        <w:t> </w:t>
+      </w:r>
+      <w:r>
+        <w:rPr>
+          <w:color w:val="334054"/>
+        </w:rPr>
+        <w:t>proof</w:t>
+      </w:r>
+      <w:r>
+        <w:rPr>
+          <w:color w:val="334054"/>
+          <w:spacing w:val="-4"/>
+        </w:rPr>
+        <w:t> </w:t>
+      </w:r>
+      <w:r>
+        <w:rPr>
+          <w:color w:val="334054"/>
+        </w:rPr>
+        <w:t>verification, created database reset script, and compiled Word/PDF documentation.</w:t>
       </w:r>
     </w:p>
     <w:p>
@@ -22845,178 +23478,754 @@
         <w:rPr>
           <w:b/>
           <w:color w:val="334054"/>
+          <w:spacing w:val="-1"/>
+          <w:sz w:val="21"/>
+        </w:rPr>
+        <w:t> </w:t>
+      </w:r>
+      <w:r>
+        <w:rPr>
+          <w:b/>
+          <w:color w:val="334054"/>
+          <w:sz w:val="21"/>
+        </w:rPr>
+        <w:t>9 (Leaflet Map,</w:t>
+      </w:r>
+      <w:r>
+        <w:rPr>
+          <w:b/>
+          <w:color w:val="334054"/>
+          <w:spacing w:val="-1"/>
+          <w:sz w:val="21"/>
+        </w:rPr>
+        <w:t> </w:t>
+      </w:r>
+      <w:r>
+        <w:rPr>
+          <w:b/>
+          <w:color w:val="334054"/>
+          <w:sz w:val="21"/>
+        </w:rPr>
+        <w:t>Global Geocoding &amp; Customs</w:t>
+      </w:r>
+      <w:r>
+        <w:rPr>
+          <w:b/>
+          <w:color w:val="334054"/>
+          <w:spacing w:val="-1"/>
+          <w:sz w:val="21"/>
+        </w:rPr>
+        <w:t> </w:t>
+      </w:r>
+      <w:r>
+        <w:rPr>
+          <w:b/>
+          <w:color w:val="334054"/>
+          <w:sz w:val="21"/>
+        </w:rPr>
+        <w:t>Compliance):</w:t>
+      </w:r>
+      <w:r>
+        <w:rPr>
+          <w:b/>
+          <w:color w:val="334054"/>
+          <w:spacing w:val="-1"/>
+          <w:sz w:val="21"/>
+        </w:rPr>
+        <w:t> </w:t>
+      </w:r>
+      <w:r>
+        <w:rPr>
+          <w:color w:val="334054"/>
+          <w:sz w:val="21"/>
+        </w:rPr>
+        <w:t>Integrated real </w:t>
+      </w:r>
+      <w:r>
+        <w:rPr>
+          <w:color w:val="334054"/>
           <w:spacing w:val="-2"/>
           <w:sz w:val="21"/>
         </w:rPr>
-        <w:t> </w:t>
-      </w:r>
-      <w:r>
-        <w:rPr>
-          <w:b/>
-          <w:color w:val="334054"/>
-          <w:sz w:val="21"/>
-        </w:rPr>
-        <w:t>8</w:t>
-      </w:r>
-      <w:r>
-        <w:rPr>
-          <w:b/>
+        <w:t>interactive</w:t>
+      </w:r>
+    </w:p>
+    <w:p>
+      <w:pPr>
+        <w:pStyle w:val="BodyText"/>
+        <w:spacing w:line="283" w:lineRule="auto" w:before="51"/>
+        <w:ind w:left="387"/>
+      </w:pPr>
+      <w:r>
+        <w:rPr>
+          <w:color w:val="334054"/>
+        </w:rPr>
+        <w:t>Leaflet</w:t>
+      </w:r>
+      <w:r>
+        <w:rPr>
+          <w:color w:val="334054"/>
+          <w:spacing w:val="-3"/>
+        </w:rPr>
+        <w:t> </w:t>
+      </w:r>
+      <w:r>
+        <w:rPr>
+          <w:color w:val="334054"/>
+        </w:rPr>
+        <w:t>map</w:t>
+      </w:r>
+      <w:r>
+        <w:rPr>
+          <w:color w:val="334054"/>
+          <w:spacing w:val="-3"/>
+        </w:rPr>
+        <w:t> </w:t>
+      </w:r>
+      <w:r>
+        <w:rPr>
+          <w:color w:val="334054"/>
+        </w:rPr>
+        <w:t>with</w:t>
+      </w:r>
+      <w:r>
+        <w:rPr>
+          <w:color w:val="334054"/>
+          <w:spacing w:val="-3"/>
+        </w:rPr>
+        <w:t> </w:t>
+      </w:r>
+      <w:r>
+        <w:rPr>
+          <w:color w:val="334054"/>
+        </w:rPr>
+        <w:t>direct</w:t>
+      </w:r>
+      <w:r>
+        <w:rPr>
+          <w:color w:val="334054"/>
+          <w:spacing w:val="-3"/>
+        </w:rPr>
+        <w:t> </w:t>
+      </w:r>
+      <w:r>
+        <w:rPr>
+          <w:color w:val="334054"/>
+        </w:rPr>
+        <w:t>click-to-pin,</w:t>
+      </w:r>
+      <w:r>
+        <w:rPr>
+          <w:color w:val="334054"/>
+          <w:spacing w:val="-3"/>
+        </w:rPr>
+        <w:t> </w:t>
+      </w:r>
+      <w:r>
+        <w:rPr>
+          <w:color w:val="334054"/>
+        </w:rPr>
+        <w:t>built</w:t>
+      </w:r>
+      <w:r>
+        <w:rPr>
+          <w:color w:val="334054"/>
+          <w:spacing w:val="-3"/>
+        </w:rPr>
+        <w:t> </w:t>
+      </w:r>
+      <w:r>
+        <w:rPr>
+          <w:color w:val="334054"/>
+        </w:rPr>
+        <w:t>offline</w:t>
+      </w:r>
+      <w:r>
+        <w:rPr>
+          <w:color w:val="334054"/>
+          <w:spacing w:val="-3"/>
+        </w:rPr>
+        <w:t> </w:t>
+      </w:r>
+      <w:r>
+        <w:rPr>
+          <w:color w:val="334054"/>
+        </w:rPr>
+        <w:t>Indonesian</w:t>
+      </w:r>
+      <w:r>
+        <w:rPr>
+          <w:color w:val="334054"/>
+          <w:spacing w:val="-3"/>
+        </w:rPr>
+        <w:t> </w:t>
+      </w:r>
+      <w:r>
+        <w:rPr>
+          <w:color w:val="334054"/>
+        </w:rPr>
+        <w:t>&amp;</w:t>
+      </w:r>
+      <w:r>
+        <w:rPr>
+          <w:color w:val="334054"/>
+          <w:spacing w:val="-3"/>
+        </w:rPr>
+        <w:t> </w:t>
+      </w:r>
+      <w:r>
+        <w:rPr>
+          <w:color w:val="334054"/>
+        </w:rPr>
+        <w:t>global</w:t>
+      </w:r>
+      <w:r>
+        <w:rPr>
+          <w:color w:val="334054"/>
+          <w:spacing w:val="-3"/>
+        </w:rPr>
+        <w:t> </w:t>
+      </w:r>
+      <w:r>
+        <w:rPr>
+          <w:color w:val="334054"/>
+        </w:rPr>
+        <w:t>cities</w:t>
+      </w:r>
+      <w:r>
+        <w:rPr>
+          <w:color w:val="334054"/>
+          <w:spacing w:val="-3"/>
+        </w:rPr>
+        <w:t> </w:t>
+      </w:r>
+      <w:r>
+        <w:rPr>
+          <w:color w:val="334054"/>
+        </w:rPr>
+        <w:t>search</w:t>
+      </w:r>
+      <w:r>
+        <w:rPr>
+          <w:color w:val="334054"/>
+          <w:spacing w:val="-3"/>
+        </w:rPr>
+        <w:t> </w:t>
+      </w:r>
+      <w:r>
+        <w:rPr>
+          <w:color w:val="334054"/>
+        </w:rPr>
+        <w:t>index,</w:t>
+      </w:r>
+      <w:r>
+        <w:rPr>
+          <w:color w:val="334054"/>
+          <w:spacing w:val="-3"/>
+        </w:rPr>
+        <w:t> </w:t>
+      </w:r>
+      <w:r>
+        <w:rPr>
+          <w:color w:val="334054"/>
+        </w:rPr>
+        <w:t>created</w:t>
+      </w:r>
+      <w:r>
+        <w:rPr>
+          <w:color w:val="334054"/>
+          <w:spacing w:val="-3"/>
+        </w:rPr>
+        <w:t> </w:t>
+      </w:r>
+      <w:r>
+        <w:rPr>
+          <w:color w:val="334054"/>
+        </w:rPr>
+        <w:t>4-</w:t>
+      </w:r>
+      <w:r>
+        <w:rPr>
+          <w:color w:val="334054"/>
+        </w:rPr>
+        <w:t>tier dynamic logistics routing (Motorbike, Overland Express, Air Cargo, DHL/FedEx International), and</w:t>
+      </w:r>
+    </w:p>
+    <w:p>
+      <w:pPr>
+        <w:pStyle w:val="BodyText"/>
+        <w:spacing w:line="283" w:lineRule="auto" w:before="16"/>
+        <w:ind w:left="387" w:right="566"/>
+      </w:pPr>
+      <w:r>
+        <w:rPr>
+          <w:color w:val="334054"/>
+        </w:rPr>
+        <w:t>implemented</w:t>
+      </w:r>
+      <w:r>
+        <w:rPr>
+          <w:color w:val="334054"/>
+          <w:spacing w:val="-8"/>
+        </w:rPr>
+        <w:t> </w:t>
+      </w:r>
+      <w:r>
+        <w:rPr>
+          <w:color w:val="334054"/>
+        </w:rPr>
+        <w:t>Indonesian</w:t>
+      </w:r>
+      <w:r>
+        <w:rPr>
+          <w:color w:val="334054"/>
+          <w:spacing w:val="-8"/>
+        </w:rPr>
+        <w:t> </w:t>
+      </w:r>
+      <w:r>
+        <w:rPr>
+          <w:color w:val="334054"/>
+        </w:rPr>
+        <w:t>Bea</w:t>
+      </w:r>
+      <w:r>
+        <w:rPr>
+          <w:color w:val="334054"/>
+          <w:spacing w:val="-8"/>
+        </w:rPr>
+        <w:t> </w:t>
+      </w:r>
+      <w:r>
+        <w:rPr>
+          <w:color w:val="334054"/>
+        </w:rPr>
+        <w:t>Cukai</w:t>
+      </w:r>
+      <w:r>
+        <w:rPr>
+          <w:color w:val="334054"/>
+          <w:spacing w:val="-8"/>
+        </w:rPr>
+        <w:t> </w:t>
+      </w:r>
+      <w:r>
+        <w:rPr>
+          <w:color w:val="334054"/>
+        </w:rPr>
+        <w:t>&amp;</w:t>
+      </w:r>
+      <w:r>
+        <w:rPr>
+          <w:color w:val="334054"/>
+          <w:spacing w:val="-8"/>
+        </w:rPr>
+        <w:t> </w:t>
+      </w:r>
+      <w:r>
+        <w:rPr>
+          <w:color w:val="334054"/>
+        </w:rPr>
+        <w:t>WTO</w:t>
+      </w:r>
+      <w:r>
+        <w:rPr>
+          <w:color w:val="334054"/>
+          <w:spacing w:val="-8"/>
+        </w:rPr>
+        <w:t> </w:t>
+      </w:r>
+      <w:r>
+        <w:rPr>
+          <w:color w:val="334054"/>
+        </w:rPr>
+        <w:t>customs</w:t>
+      </w:r>
+      <w:r>
+        <w:rPr>
+          <w:color w:val="334054"/>
+          <w:spacing w:val="-8"/>
+        </w:rPr>
+        <w:t> </w:t>
+      </w:r>
+      <w:r>
+        <w:rPr>
+          <w:color w:val="334054"/>
+        </w:rPr>
+        <w:t>compliance</w:t>
+      </w:r>
+      <w:r>
+        <w:rPr>
+          <w:color w:val="334054"/>
+          <w:spacing w:val="-8"/>
+        </w:rPr>
+        <w:t> </w:t>
+      </w:r>
+      <w:r>
+        <w:rPr>
+          <w:color w:val="334054"/>
+        </w:rPr>
+        <w:t>(0%</w:t>
+      </w:r>
+      <w:r>
+        <w:rPr>
+          <w:color w:val="334054"/>
+          <w:spacing w:val="-8"/>
+        </w:rPr>
+        <w:t> </w:t>
+      </w:r>
+      <w:r>
+        <w:rPr>
+          <w:color w:val="334054"/>
+        </w:rPr>
+        <w:t>Export</w:t>
+      </w:r>
+      <w:r>
+        <w:rPr>
+          <w:color w:val="334054"/>
+          <w:spacing w:val="-8"/>
+        </w:rPr>
+        <w:t> </w:t>
+      </w:r>
+      <w:r>
+        <w:rPr>
+          <w:color w:val="334054"/>
+        </w:rPr>
+        <w:t>Tariff,</w:t>
+      </w:r>
+      <w:r>
+        <w:rPr>
+          <w:color w:val="334054"/>
+          <w:spacing w:val="-8"/>
+        </w:rPr>
+        <w:t> </w:t>
+      </w:r>
+      <w:r>
+        <w:rPr>
+          <w:color w:val="334054"/>
+        </w:rPr>
+        <w:t>0%</w:t>
+      </w:r>
+      <w:r>
+        <w:rPr>
+          <w:color w:val="334054"/>
+          <w:spacing w:val="-8"/>
+        </w:rPr>
+        <w:t> </w:t>
+      </w:r>
+      <w:r>
+        <w:rPr>
+          <w:color w:val="334054"/>
+        </w:rPr>
+        <w:t>VAT</w:t>
+      </w:r>
+      <w:r>
+        <w:rPr>
+          <w:color w:val="334054"/>
+          <w:spacing w:val="-8"/>
+        </w:rPr>
+        <w:t> </w:t>
+      </w:r>
+      <w:r>
+        <w:rPr>
+          <w:color w:val="334054"/>
+        </w:rPr>
+        <w:t>Export Zero-Rated, DDU Destination Clearance).</w:t>
+      </w:r>
+    </w:p>
+    <w:p>
+      <w:pPr>
+        <w:pStyle w:val="Heading3"/>
+        <w:numPr>
+          <w:ilvl w:val="0"/>
+          <w:numId w:val="5"/>
+        </w:numPr>
+        <w:tabs>
+          <w:tab w:pos="387" w:val="left" w:leader="none"/>
+        </w:tabs>
+        <w:spacing w:line="240" w:lineRule="auto" w:before="105" w:after="0"/>
+        <w:ind w:left="387" w:right="0" w:hanging="255"/>
+        <w:jc w:val="left"/>
+      </w:pPr>
+      <w:r>
+        <w:rPr>
+          <w:color w:val="334054"/>
+        </w:rPr>
+        <w:t>Session</w:t>
+      </w:r>
+      <w:r>
+        <w:rPr>
+          <w:color w:val="334054"/>
+          <w:spacing w:val="-2"/>
+        </w:rPr>
+        <w:t> </w:t>
+      </w:r>
+      <w:r>
+        <w:rPr>
+          <w:color w:val="334054"/>
+        </w:rPr>
+        <w:t>10</w:t>
+      </w:r>
+      <w:r>
+        <w:rPr>
           <w:color w:val="334054"/>
           <w:spacing w:val="-1"/>
-          <w:sz w:val="21"/>
-        </w:rPr>
-        <w:t> </w:t>
-      </w:r>
-      <w:r>
-        <w:rPr>
-          <w:b/>
-          <w:color w:val="334054"/>
-          <w:sz w:val="21"/>
-        </w:rPr>
-        <w:t>(Single-Merchant</w:t>
-      </w:r>
-      <w:r>
-        <w:rPr>
-          <w:b/>
+        </w:rPr>
+        <w:t> </w:t>
+      </w:r>
+      <w:r>
+        <w:rPr>
+          <w:color w:val="334054"/>
+        </w:rPr>
+        <w:t>(Inventory</w:t>
+      </w:r>
+      <w:r>
+        <w:rPr>
+          <w:color w:val="334054"/>
+          <w:spacing w:val="-2"/>
+        </w:rPr>
+        <w:t> </w:t>
+      </w:r>
+      <w:r>
+        <w:rPr>
+          <w:color w:val="334054"/>
+        </w:rPr>
+        <w:t>Stock</w:t>
+      </w:r>
+      <w:r>
+        <w:rPr>
           <w:color w:val="334054"/>
           <w:spacing w:val="-1"/>
-          <w:sz w:val="21"/>
-        </w:rPr>
-        <w:t> </w:t>
-      </w:r>
-      <w:r>
-        <w:rPr>
-          <w:b/>
-          <w:color w:val="334054"/>
-          <w:sz w:val="21"/>
-        </w:rPr>
-        <w:t>Architecture</w:t>
-      </w:r>
-      <w:r>
-        <w:rPr>
-          <w:b/>
+        </w:rPr>
+        <w:t> </w:t>
+      </w:r>
+      <w:r>
+        <w:rPr>
+          <w:color w:val="334054"/>
+        </w:rPr>
+        <w:t>Automation,</w:t>
+      </w:r>
+      <w:r>
+        <w:rPr>
+          <w:color w:val="334054"/>
+          <w:spacing w:val="-2"/>
+        </w:rPr>
+        <w:t> </w:t>
+      </w:r>
+      <w:r>
+        <w:rPr>
+          <w:color w:val="334054"/>
+        </w:rPr>
+        <w:t>Cancellation</w:t>
+      </w:r>
+      <w:r>
+        <w:rPr>
           <w:color w:val="334054"/>
           <w:spacing w:val="-1"/>
-          <w:sz w:val="21"/>
-        </w:rPr>
-        <w:t> </w:t>
-      </w:r>
-      <w:r>
-        <w:rPr>
-          <w:b/>
-          <w:color w:val="334054"/>
-          <w:sz w:val="21"/>
+        </w:rPr>
+        <w:t> </w:t>
+      </w:r>
+      <w:r>
+        <w:rPr>
+          <w:color w:val="334054"/>
+        </w:rPr>
+        <w:t>Restitution</w:t>
+      </w:r>
+      <w:r>
+        <w:rPr>
+          <w:color w:val="334054"/>
+          <w:spacing w:val="-2"/>
+        </w:rPr>
+        <w:t> </w:t>
+      </w:r>
+      <w:r>
+        <w:rPr>
+          <w:color w:val="334054"/>
         </w:rPr>
         <w:t>&amp;</w:t>
       </w:r>
       <w:r>
         <w:rPr>
-          <w:b/>
           <w:color w:val="334054"/>
           <w:spacing w:val="-1"/>
-          <w:sz w:val="21"/>
-        </w:rPr>
-        <w:t> </w:t>
-      </w:r>
-      <w:r>
-        <w:rPr>
-          <w:b/>
-          <w:color w:val="334054"/>
-          <w:sz w:val="21"/>
-        </w:rPr>
-        <w:t>Final</w:t>
-      </w:r>
-      <w:r>
-        <w:rPr>
-          <w:b/>
+        </w:rPr>
+        <w:t> </w:t>
+      </w:r>
+      <w:r>
+        <w:rPr>
+          <w:color w:val="334054"/>
+        </w:rPr>
+        <w:t>Database</w:t>
+      </w:r>
+      <w:r>
+        <w:rPr>
           <w:color w:val="334054"/>
           <w:spacing w:val="-1"/>
-          <w:sz w:val="21"/>
-        </w:rPr>
-        <w:t> </w:t>
-      </w:r>
-      <w:r>
-        <w:rPr>
-          <w:b/>
-          <w:color w:val="334054"/>
-          <w:sz w:val="21"/>
-        </w:rPr>
-        <w:t>Submission):</w:t>
-      </w:r>
-      <w:r>
-        <w:rPr>
-          <w:b/>
+        </w:rPr>
+        <w:t> </w:t>
+      </w:r>
+      <w:r>
+        <w:rPr>
           <w:color w:val="334054"/>
           <w:spacing w:val="-2"/>
-          <w:sz w:val="21"/>
-        </w:rPr>
-        <w:t> </w:t>
-      </w:r>
-      <w:r>
-        <w:rPr>
-          <w:color w:val="334054"/>
-          <w:sz w:val="21"/>
-        </w:rPr>
-        <w:t>Streamlined</w:t>
-      </w:r>
-      <w:r>
-        <w:rPr>
-          <w:color w:val="334054"/>
-          <w:spacing w:val="-1"/>
-          <w:sz w:val="21"/>
-        </w:rPr>
-        <w:t> </w:t>
-      </w:r>
-      <w:r>
-        <w:rPr>
-          <w:color w:val="334054"/>
-          <w:sz w:val="21"/>
-        </w:rPr>
-        <w:t>architecture</w:t>
-      </w:r>
-      <w:r>
-        <w:rPr>
-          <w:color w:val="334054"/>
-          <w:spacing w:val="-1"/>
-          <w:sz w:val="21"/>
-        </w:rPr>
-        <w:t> </w:t>
-      </w:r>
-      <w:r>
-        <w:rPr>
-          <w:color w:val="334054"/>
-          <w:sz w:val="21"/>
-        </w:rPr>
-        <w:t>to</w:t>
-      </w:r>
-      <w:r>
-        <w:rPr>
-          <w:color w:val="334054"/>
-          <w:spacing w:val="-1"/>
-          <w:sz w:val="21"/>
-        </w:rPr>
-        <w:t> </w:t>
+        </w:rPr>
+        <w:t>Reset):</w:t>
+      </w:r>
+    </w:p>
+    <w:p>
+      <w:pPr>
+        <w:pStyle w:val="BodyText"/>
+        <w:spacing w:line="283" w:lineRule="auto" w:before="51"/>
+        <w:ind w:left="387"/>
+      </w:pPr>
+      <w:r>
+        <w:rPr>
+          <w:color w:val="334054"/>
+        </w:rPr>
+        <w:t>Implemented</w:t>
       </w:r>
       <w:r>
         <w:rPr>
           <w:color w:val="334054"/>
           <w:spacing w:val="-4"/>
-          <w:sz w:val="21"/>
-        </w:rPr>
-        <w:t>pure</w:t>
+        </w:rPr>
+        <w:t> </w:t>
+      </w:r>
+      <w:r>
+        <w:rPr>
+          <w:color w:val="334054"/>
+        </w:rPr>
+        <w:t>automated</w:t>
+      </w:r>
+      <w:r>
+        <w:rPr>
+          <w:color w:val="334054"/>
+          <w:spacing w:val="-4"/>
+        </w:rPr>
+        <w:t> </w:t>
+      </w:r>
+      <w:r>
+        <w:rPr>
+          <w:color w:val="334054"/>
+        </w:rPr>
+        <w:t>catalog</w:t>
+      </w:r>
+      <w:r>
+        <w:rPr>
+          <w:color w:val="334054"/>
+          <w:spacing w:val="-4"/>
+        </w:rPr>
+        <w:t> </w:t>
+      </w:r>
+      <w:r>
+        <w:rPr>
+          <w:color w:val="334054"/>
+        </w:rPr>
+        <w:t>inventory</w:t>
+      </w:r>
+      <w:r>
+        <w:rPr>
+          <w:color w:val="334054"/>
+          <w:spacing w:val="-4"/>
+        </w:rPr>
+        <w:t> </w:t>
+      </w:r>
+      <w:r>
+        <w:rPr>
+          <w:color w:val="334054"/>
+        </w:rPr>
+        <w:t>stock</w:t>
+      </w:r>
+      <w:r>
+        <w:rPr>
+          <w:color w:val="334054"/>
+          <w:spacing w:val="-4"/>
+        </w:rPr>
+        <w:t> </w:t>
+      </w:r>
+      <w:r>
+        <w:rPr>
+          <w:color w:val="334054"/>
+        </w:rPr>
+        <w:t>decrement</w:t>
+      </w:r>
+      <w:r>
+        <w:rPr>
+          <w:color w:val="334054"/>
+          <w:spacing w:val="-4"/>
+        </w:rPr>
+        <w:t> </w:t>
+      </w:r>
+      <w:r>
+        <w:rPr>
+          <w:color w:val="334054"/>
+        </w:rPr>
+        <w:t>upon</w:t>
+      </w:r>
+      <w:r>
+        <w:rPr>
+          <w:color w:val="334054"/>
+          <w:spacing w:val="-4"/>
+        </w:rPr>
+        <w:t> </w:t>
+      </w:r>
+      <w:r>
+        <w:rPr>
+          <w:color w:val="334054"/>
+        </w:rPr>
+        <w:t>order</w:t>
+      </w:r>
+      <w:r>
+        <w:rPr>
+          <w:color w:val="334054"/>
+          <w:spacing w:val="-4"/>
+        </w:rPr>
+        <w:t> </w:t>
+      </w:r>
+      <w:r>
+        <w:rPr>
+          <w:color w:val="334054"/>
+        </w:rPr>
+        <w:t>completion,</w:t>
+      </w:r>
+      <w:r>
+        <w:rPr>
+          <w:color w:val="334054"/>
+          <w:spacing w:val="-4"/>
+        </w:rPr>
+        <w:t> </w:t>
+      </w:r>
+      <w:r>
+        <w:rPr>
+          <w:color w:val="334054"/>
+        </w:rPr>
+        <w:t>automated</w:t>
+      </w:r>
+      <w:r>
+        <w:rPr>
+          <w:color w:val="334054"/>
+          <w:spacing w:val="-4"/>
+        </w:rPr>
+        <w:t> </w:t>
+      </w:r>
+      <w:r>
+        <w:rPr>
+          <w:color w:val="334054"/>
+        </w:rPr>
+        <w:t>stock replenishment upon order cancellation, de-duplicated store catalog action buttons, added 1-click</w:t>
       </w:r>
     </w:p>
     <w:p>
       <w:pPr>
         <w:pStyle w:val="BodyText"/>
-        <w:spacing w:line="283" w:lineRule="auto" w:before="50"/>
+        <w:spacing w:line="283" w:lineRule="auto" w:before="16"/>
         <w:ind w:left="387"/>
       </w:pPr>
       <w:r>
         <w:rPr>
           <w:color w:val="334054"/>
         </w:rPr>
-        <w:t>single-merchant</w:t>
+        <w:t>Database</w:t>
       </w:r>
       <w:r>
         <w:rPr>
@@ -23029,7 +24238,7 @@
         <w:rPr>
           <w:color w:val="334054"/>
         </w:rPr>
-        <w:t>operations,</w:t>
+        <w:t>Reset</w:t>
       </w:r>
       <w:r>
         <w:rPr>
@@ -23042,7 +24251,7 @@
         <w:rPr>
           <w:color w:val="334054"/>
         </w:rPr>
-        <w:t>removed</w:t>
+        <w:t>modal</w:t>
       </w:r>
       <w:r>
         <w:rPr>
@@ -23055,7 +24264,7 @@
         <w:rPr>
           <w:color w:val="334054"/>
         </w:rPr>
-        <w:t>registration</w:t>
+        <w:t>in</w:t>
       </w:r>
       <w:r>
         <w:rPr>
@@ -23068,7 +24277,7 @@
         <w:rPr>
           <w:color w:val="334054"/>
         </w:rPr>
-        <w:t>confusion,</w:t>
+        <w:t>the</w:t>
       </w:r>
       <w:r>
         <w:rPr>
@@ -23081,7 +24290,7 @@
         <w:rPr>
           <w:color w:val="334054"/>
         </w:rPr>
-        <w:t>added</w:t>
+        <w:t>Admin</w:t>
       </w:r>
       <w:r>
         <w:rPr>
@@ -23094,7 +24303,7 @@
         <w:rPr>
           <w:color w:val="334054"/>
         </w:rPr>
-        <w:t>QRIS</w:t>
+        <w:t>Dashboard,</w:t>
       </w:r>
       <w:r>
         <w:rPr>
@@ -23107,7 +24316,7 @@
         <w:rPr>
           <w:color w:val="334054"/>
         </w:rPr>
-        <w:t>screenshot</w:t>
+        <w:t>and</w:t>
       </w:r>
       <w:r>
         <w:rPr>
@@ -23120,7 +24329,7 @@
         <w:rPr>
           <w:color w:val="334054"/>
         </w:rPr>
-        <w:t>proof</w:t>
+        <w:t>established</w:t>
       </w:r>
       <w:r>
         <w:rPr>
@@ -23133,7 +24342,46 @@
         <w:rPr>
           <w:color w:val="334054"/>
         </w:rPr>
-        <w:t>verification, created database reset script, and compiled Word/PDF documentation.</w:t>
+        <w:t>mandatory</w:t>
+      </w:r>
+      <w:r>
+        <w:rPr>
+          <w:color w:val="334054"/>
+          <w:spacing w:val="-4"/>
+        </w:rPr>
+        <w:t> </w:t>
+      </w:r>
+      <w:r>
+        <w:rPr>
+          <w:color w:val="334054"/>
+        </w:rPr>
+        <w:t>planning</w:t>
+      </w:r>
+      <w:r>
+        <w:rPr>
+          <w:color w:val="334054"/>
+          <w:spacing w:val="-4"/>
+        </w:rPr>
+        <w:t> </w:t>
+      </w:r>
+      <w:r>
+        <w:rPr>
+          <w:color w:val="334054"/>
+        </w:rPr>
+        <w:t>and</w:t>
+      </w:r>
+      <w:r>
+        <w:rPr>
+          <w:color w:val="334054"/>
+          <w:spacing w:val="-4"/>
+        </w:rPr>
+        <w:t> </w:t>
+      </w:r>
+      <w:r>
+        <w:rPr>
+          <w:color w:val="334054"/>
+        </w:rPr>
+        <w:t>docs synchronization agent rules.</w:t>
       </w:r>
     </w:p>
     <w:p>
@@ -23146,8 +24394,8 @@
         <w:tabs>
           <w:tab w:pos="387" w:val="left" w:leader="none"/>
         </w:tabs>
-        <w:spacing w:line="240" w:lineRule="auto" w:before="106" w:after="0"/>
-        <w:ind w:left="387" w:right="0" w:hanging="255"/>
+        <w:spacing w:line="283" w:lineRule="auto" w:before="106" w:after="0"/>
+        <w:ind w:left="387" w:right="203" w:hanging="255"/>
         <w:jc w:val="left"/>
         <w:rPr>
           <w:sz w:val="21"/>
@@ -23165,893 +24413,202 @@
         <w:rPr>
           <w:b/>
           <w:color w:val="334054"/>
-          <w:spacing w:val="-1"/>
-          <w:sz w:val="21"/>
-        </w:rPr>
-        <w:t> </w:t>
-      </w:r>
-      <w:r>
-        <w:rPr>
-          <w:b/>
-          <w:color w:val="334054"/>
-          <w:sz w:val="21"/>
-        </w:rPr>
-        <w:t>9 (Leaflet Map,</w:t>
-      </w:r>
-      <w:r>
-        <w:rPr>
-          <w:b/>
-          <w:color w:val="334054"/>
-          <w:spacing w:val="-1"/>
-          <w:sz w:val="21"/>
-        </w:rPr>
-        <w:t> </w:t>
-      </w:r>
-      <w:r>
-        <w:rPr>
-          <w:b/>
-          <w:color w:val="334054"/>
-          <w:sz w:val="21"/>
-        </w:rPr>
-        <w:t>Global Geocoding &amp; Customs</w:t>
-      </w:r>
-      <w:r>
-        <w:rPr>
-          <w:b/>
-          <w:color w:val="334054"/>
-          <w:spacing w:val="-1"/>
-          <w:sz w:val="21"/>
-        </w:rPr>
-        <w:t> </w:t>
-      </w:r>
-      <w:r>
-        <w:rPr>
-          <w:b/>
-          <w:color w:val="334054"/>
-          <w:sz w:val="21"/>
-        </w:rPr>
-        <w:t>Compliance):</w:t>
-      </w:r>
-      <w:r>
-        <w:rPr>
-          <w:b/>
-          <w:color w:val="334054"/>
-          <w:spacing w:val="-1"/>
-          <w:sz w:val="21"/>
-        </w:rPr>
-        <w:t> </w:t>
-      </w:r>
-      <w:r>
-        <w:rPr>
-          <w:color w:val="334054"/>
-          <w:sz w:val="21"/>
-        </w:rPr>
-        <w:t>Integrated real </w:t>
-      </w:r>
-      <w:r>
-        <w:rPr>
-          <w:color w:val="334054"/>
-          <w:spacing w:val="-2"/>
-          <w:sz w:val="21"/>
-        </w:rPr>
-        <w:t>interactive</w:t>
-      </w:r>
-    </w:p>
-    <w:p>
-      <w:pPr>
-        <w:pStyle w:val="BodyText"/>
-        <w:spacing w:line="297" w:lineRule="auto" w:before="51"/>
-        <w:ind w:left="387"/>
-      </w:pPr>
-      <w:r>
-        <w:rPr>
-          <w:color w:val="334054"/>
-        </w:rPr>
-        <w:t>Leaflet</w:t>
-      </w:r>
-      <w:r>
-        <w:rPr>
-          <w:color w:val="334054"/>
-          <w:spacing w:val="-3"/>
-        </w:rPr>
-        <w:t> </w:t>
-      </w:r>
-      <w:r>
-        <w:rPr>
-          <w:color w:val="334054"/>
-        </w:rPr>
-        <w:t>map</w:t>
-      </w:r>
-      <w:r>
-        <w:rPr>
-          <w:color w:val="334054"/>
-          <w:spacing w:val="-3"/>
-        </w:rPr>
-        <w:t> </w:t>
-      </w:r>
-      <w:r>
-        <w:rPr>
-          <w:color w:val="334054"/>
-        </w:rPr>
-        <w:t>with</w:t>
-      </w:r>
-      <w:r>
-        <w:rPr>
-          <w:color w:val="334054"/>
-          <w:spacing w:val="-3"/>
-        </w:rPr>
-        <w:t> </w:t>
-      </w:r>
-      <w:r>
-        <w:rPr>
-          <w:color w:val="334054"/>
-        </w:rPr>
-        <w:t>direct</w:t>
-      </w:r>
-      <w:r>
-        <w:rPr>
-          <w:color w:val="334054"/>
-          <w:spacing w:val="-3"/>
-        </w:rPr>
-        <w:t> </w:t>
-      </w:r>
-      <w:r>
-        <w:rPr>
-          <w:color w:val="334054"/>
-        </w:rPr>
-        <w:t>click-to-pin,</w:t>
-      </w:r>
-      <w:r>
-        <w:rPr>
-          <w:color w:val="334054"/>
-          <w:spacing w:val="-3"/>
-        </w:rPr>
-        <w:t> </w:t>
-      </w:r>
-      <w:r>
-        <w:rPr>
-          <w:color w:val="334054"/>
-        </w:rPr>
-        <w:t>built</w:t>
-      </w:r>
-      <w:r>
-        <w:rPr>
-          <w:color w:val="334054"/>
-          <w:spacing w:val="-3"/>
-        </w:rPr>
-        <w:t> </w:t>
-      </w:r>
-      <w:r>
-        <w:rPr>
-          <w:color w:val="334054"/>
-        </w:rPr>
-        <w:t>offline</w:t>
-      </w:r>
-      <w:r>
-        <w:rPr>
-          <w:color w:val="334054"/>
-          <w:spacing w:val="-3"/>
-        </w:rPr>
-        <w:t> </w:t>
-      </w:r>
-      <w:r>
-        <w:rPr>
-          <w:color w:val="334054"/>
-        </w:rPr>
-        <w:t>Indonesian</w:t>
-      </w:r>
-      <w:r>
-        <w:rPr>
-          <w:color w:val="334054"/>
-          <w:spacing w:val="-3"/>
-        </w:rPr>
-        <w:t> </w:t>
-      </w:r>
-      <w:r>
-        <w:rPr>
-          <w:color w:val="334054"/>
+          <w:spacing w:val="-7"/>
+          <w:sz w:val="21"/>
+        </w:rPr>
+        <w:t> </w:t>
+      </w:r>
+      <w:r>
+        <w:rPr>
+          <w:b/>
+          <w:color w:val="334054"/>
+          <w:sz w:val="21"/>
+        </w:rPr>
+        <w:t>11</w:t>
+      </w:r>
+      <w:r>
+        <w:rPr>
+          <w:b/>
+          <w:color w:val="334054"/>
+          <w:spacing w:val="-7"/>
+          <w:sz w:val="21"/>
+        </w:rPr>
+        <w:t> </w:t>
+      </w:r>
+      <w:r>
+        <w:rPr>
+          <w:b/>
+          <w:color w:val="334054"/>
+          <w:sz w:val="21"/>
+        </w:rPr>
+        <w:t>(Persistent</w:t>
+      </w:r>
+      <w:r>
+        <w:rPr>
+          <w:b/>
+          <w:color w:val="334054"/>
+          <w:spacing w:val="-7"/>
+          <w:sz w:val="21"/>
+        </w:rPr>
+        <w:t> </w:t>
+      </w:r>
+      <w:r>
+        <w:rPr>
+          <w:b/>
+          <w:color w:val="334054"/>
+          <w:sz w:val="21"/>
+        </w:rPr>
+        <w:t>Reset</w:t>
+      </w:r>
+      <w:r>
+        <w:rPr>
+          <w:b/>
+          <w:color w:val="334054"/>
+          <w:spacing w:val="-7"/>
+          <w:sz w:val="21"/>
+        </w:rPr>
+        <w:t> </w:t>
+      </w:r>
+      <w:r>
+        <w:rPr>
+          <w:b/>
+          <w:color w:val="334054"/>
+          <w:sz w:val="21"/>
+        </w:rPr>
+        <w:t>State,</w:t>
+      </w:r>
+      <w:r>
+        <w:rPr>
+          <w:b/>
+          <w:color w:val="334054"/>
+          <w:spacing w:val="-7"/>
+          <w:sz w:val="21"/>
+        </w:rPr>
+        <w:t> </w:t>
+      </w:r>
+      <w:r>
+        <w:rPr>
+          <w:b/>
+          <w:color w:val="334054"/>
+          <w:sz w:val="21"/>
+        </w:rPr>
+        <w:t>Realtime</w:t>
+      </w:r>
+      <w:r>
+        <w:rPr>
+          <w:b/>
+          <w:color w:val="334054"/>
+          <w:spacing w:val="-7"/>
+          <w:sz w:val="21"/>
+        </w:rPr>
+        <w:t> </w:t>
+      </w:r>
+      <w:r>
+        <w:rPr>
+          <w:b/>
+          <w:color w:val="334054"/>
+          <w:sz w:val="21"/>
+        </w:rPr>
+        <w:t>Receipt</w:t>
+      </w:r>
+      <w:r>
+        <w:rPr>
+          <w:b/>
+          <w:color w:val="334054"/>
+          <w:spacing w:val="-7"/>
+          <w:sz w:val="21"/>
+        </w:rPr>
+        <w:t> </w:t>
+      </w:r>
+      <w:r>
+        <w:rPr>
+          <w:b/>
+          <w:color w:val="334054"/>
+          <w:sz w:val="21"/>
+        </w:rPr>
+        <w:t>Fix</w:t>
+      </w:r>
+      <w:r>
+        <w:rPr>
+          <w:b/>
+          <w:color w:val="334054"/>
+          <w:spacing w:val="-7"/>
+          <w:sz w:val="21"/>
+        </w:rPr>
+        <w:t> </w:t>
+      </w:r>
+      <w:r>
+        <w:rPr>
+          <w:b/>
+          <w:color w:val="334054"/>
+          <w:sz w:val="21"/>
         </w:rPr>
         <w:t>&amp;</w:t>
       </w:r>
       <w:r>
         <w:rPr>
-          <w:color w:val="334054"/>
-          <w:spacing w:val="-3"/>
-        </w:rPr>
-        <w:t> </w:t>
-      </w:r>
-      <w:r>
-        <w:rPr>
-          <w:color w:val="334054"/>
-        </w:rPr>
-        <w:t>global</w:t>
-      </w:r>
-      <w:r>
-        <w:rPr>
-          <w:color w:val="334054"/>
-          <w:spacing w:val="-3"/>
-        </w:rPr>
-        <w:t> </w:t>
-      </w:r>
-      <w:r>
-        <w:rPr>
-          <w:color w:val="334054"/>
-        </w:rPr>
-        <w:t>cities</w:t>
-      </w:r>
-      <w:r>
-        <w:rPr>
-          <w:color w:val="334054"/>
-          <w:spacing w:val="-3"/>
-        </w:rPr>
-        <w:t> </w:t>
-      </w:r>
-      <w:r>
-        <w:rPr>
-          <w:color w:val="334054"/>
-        </w:rPr>
-        <w:t>search</w:t>
-      </w:r>
-      <w:r>
-        <w:rPr>
-          <w:color w:val="334054"/>
-          <w:spacing w:val="-3"/>
-        </w:rPr>
-        <w:t> </w:t>
-      </w:r>
-      <w:r>
-        <w:rPr>
-          <w:color w:val="334054"/>
-        </w:rPr>
-        <w:t>index,</w:t>
-      </w:r>
-      <w:r>
-        <w:rPr>
-          <w:color w:val="334054"/>
-          <w:spacing w:val="-3"/>
-        </w:rPr>
-        <w:t> </w:t>
-      </w:r>
-      <w:r>
-        <w:rPr>
-          <w:color w:val="334054"/>
-        </w:rPr>
-        <w:t>created</w:t>
-      </w:r>
-      <w:r>
-        <w:rPr>
-          <w:color w:val="334054"/>
-          <w:spacing w:val="-3"/>
-        </w:rPr>
-        <w:t> </w:t>
-      </w:r>
-      <w:r>
-        <w:rPr>
-          <w:color w:val="334054"/>
-        </w:rPr>
-        <w:t>4-</w:t>
-      </w:r>
-      <w:r>
-        <w:rPr>
-          <w:color w:val="334054"/>
-        </w:rPr>
-        <w:t>tier dynamic logistics routing (Motorbike, Overland Express, Air Cargo, DHL/FedEx International), and</w:t>
-      </w:r>
-    </w:p>
-    <w:p>
-      <w:pPr>
-        <w:pStyle w:val="BodyText"/>
-        <w:spacing w:line="262" w:lineRule="exact"/>
-        <w:ind w:left="387"/>
-      </w:pPr>
-      <w:r>
-        <w:rPr>
-          <w:color w:val="334054"/>
-        </w:rPr>
-        <w:t>implemented</w:t>
-      </w:r>
-      <w:r>
-        <w:rPr>
+          <w:b/>
           <w:color w:val="334054"/>
           <w:spacing w:val="-7"/>
-        </w:rPr>
-        <w:t> </w:t>
-      </w:r>
-      <w:r>
-        <w:rPr>
-          <w:color w:val="334054"/>
-        </w:rPr>
-        <w:t>Indonesian</w:t>
-      </w:r>
-      <w:r>
-        <w:rPr>
-          <w:color w:val="334054"/>
-          <w:spacing w:val="-5"/>
-        </w:rPr>
-        <w:t> </w:t>
-      </w:r>
-      <w:r>
-        <w:rPr>
-          <w:color w:val="334054"/>
-        </w:rPr>
-        <w:t>Bea</w:t>
-      </w:r>
-      <w:r>
-        <w:rPr>
-          <w:color w:val="334054"/>
-          <w:spacing w:val="-4"/>
-        </w:rPr>
-        <w:t> </w:t>
-      </w:r>
-      <w:r>
-        <w:rPr>
-          <w:color w:val="334054"/>
-        </w:rPr>
-        <w:t>Cukai</w:t>
-      </w:r>
-      <w:r>
-        <w:rPr>
-          <w:color w:val="334054"/>
-          <w:spacing w:val="-5"/>
-        </w:rPr>
-        <w:t> </w:t>
-      </w:r>
-      <w:r>
-        <w:rPr>
-          <w:color w:val="334054"/>
-        </w:rPr>
-        <w:t>&amp;</w:t>
-      </w:r>
-      <w:r>
-        <w:rPr>
-          <w:color w:val="334054"/>
-          <w:spacing w:val="-4"/>
-        </w:rPr>
-        <w:t> </w:t>
-      </w:r>
-      <w:r>
-        <w:rPr>
-          <w:color w:val="334054"/>
-        </w:rPr>
-        <w:t>WTO</w:t>
-      </w:r>
-      <w:r>
-        <w:rPr>
-          <w:color w:val="334054"/>
-          <w:spacing w:val="-5"/>
-        </w:rPr>
-        <w:t> </w:t>
-      </w:r>
-      <w:r>
-        <w:rPr>
-          <w:color w:val="334054"/>
-        </w:rPr>
-        <w:t>customs</w:t>
-      </w:r>
-      <w:r>
-        <w:rPr>
-          <w:color w:val="334054"/>
-          <w:spacing w:val="-4"/>
-        </w:rPr>
-        <w:t> </w:t>
-      </w:r>
-      <w:r>
-        <w:rPr>
-          <w:color w:val="334054"/>
-        </w:rPr>
-        <w:t>compliance</w:t>
-      </w:r>
-      <w:r>
-        <w:rPr>
-          <w:color w:val="334054"/>
-          <w:spacing w:val="-5"/>
-        </w:rPr>
-        <w:t> </w:t>
-      </w:r>
-      <w:r>
-        <w:rPr>
-          <w:color w:val="334054"/>
-        </w:rPr>
-        <w:t>(0%</w:t>
-      </w:r>
-      <w:r>
-        <w:rPr>
-          <w:color w:val="334054"/>
-          <w:spacing w:val="-4"/>
-        </w:rPr>
-        <w:t> </w:t>
-      </w:r>
-      <w:r>
-        <w:rPr>
-          <w:color w:val="334054"/>
-        </w:rPr>
-        <w:t>Export</w:t>
-      </w:r>
-      <w:r>
-        <w:rPr>
-          <w:color w:val="334054"/>
-          <w:spacing w:val="-5"/>
-        </w:rPr>
-        <w:t> </w:t>
-      </w:r>
-      <w:r>
-        <w:rPr>
-          <w:color w:val="334054"/>
-        </w:rPr>
-        <w:t>Tariff,</w:t>
-      </w:r>
-      <w:r>
-        <w:rPr>
-          <w:color w:val="334054"/>
-          <w:spacing w:val="-4"/>
-        </w:rPr>
-        <w:t> </w:t>
-      </w:r>
-      <w:r>
-        <w:rPr>
-          <w:color w:val="334054"/>
-        </w:rPr>
-        <w:t>0%</w:t>
-      </w:r>
-      <w:r>
-        <w:rPr>
-          <w:color w:val="334054"/>
-          <w:spacing w:val="-5"/>
-        </w:rPr>
-        <w:t> </w:t>
-      </w:r>
-      <w:r>
-        <w:rPr>
-          <w:color w:val="334054"/>
-        </w:rPr>
-        <w:t>VAT</w:t>
-      </w:r>
-      <w:r>
-        <w:rPr>
-          <w:color w:val="334054"/>
-          <w:spacing w:val="-4"/>
-        </w:rPr>
-        <w:t> </w:t>
-      </w:r>
-      <w:r>
-        <w:rPr>
-          <w:color w:val="334054"/>
-          <w:spacing w:val="-2"/>
-        </w:rPr>
-        <w:t>Export</w:t>
-      </w:r>
-    </w:p>
-    <w:p>
-      <w:pPr>
-        <w:pStyle w:val="BodyText"/>
-        <w:spacing w:before="51"/>
-        <w:ind w:left="387"/>
-      </w:pPr>
-      <w:r>
-        <w:rPr>
-          <w:color w:val="334054"/>
-        </w:rPr>
-        <w:t>Zero-Rated, DDU Destination </w:t>
-      </w:r>
-      <w:r>
-        <w:rPr>
-          <w:color w:val="334054"/>
-          <w:spacing w:val="-2"/>
-        </w:rPr>
-        <w:t>Clearance).</w:t>
-      </w:r>
-    </w:p>
-    <w:p>
-      <w:pPr>
-        <w:pStyle w:val="Heading3"/>
-        <w:numPr>
-          <w:ilvl w:val="0"/>
-          <w:numId w:val="5"/>
-        </w:numPr>
-        <w:tabs>
-          <w:tab w:pos="387" w:val="left" w:leader="none"/>
-        </w:tabs>
-        <w:spacing w:line="240" w:lineRule="auto" w:before="155" w:after="0"/>
-        <w:ind w:left="387" w:right="0" w:hanging="255"/>
-        <w:jc w:val="left"/>
-      </w:pPr>
-      <w:r>
-        <w:rPr>
-          <w:color w:val="334054"/>
-        </w:rPr>
-        <w:t>Session</w:t>
-      </w:r>
-      <w:r>
-        <w:rPr>
-          <w:color w:val="334054"/>
-          <w:spacing w:val="-2"/>
-        </w:rPr>
-        <w:t> </w:t>
-      </w:r>
-      <w:r>
-        <w:rPr>
-          <w:color w:val="334054"/>
-        </w:rPr>
-        <w:t>10</w:t>
-      </w:r>
-      <w:r>
-        <w:rPr>
-          <w:color w:val="334054"/>
-          <w:spacing w:val="-1"/>
-        </w:rPr>
-        <w:t> </w:t>
-      </w:r>
-      <w:r>
-        <w:rPr>
-          <w:color w:val="334054"/>
-        </w:rPr>
-        <w:t>(Inventory</w:t>
-      </w:r>
-      <w:r>
-        <w:rPr>
-          <w:color w:val="334054"/>
-          <w:spacing w:val="-2"/>
-        </w:rPr>
-        <w:t> </w:t>
-      </w:r>
-      <w:r>
-        <w:rPr>
-          <w:color w:val="334054"/>
-        </w:rPr>
-        <w:t>Stock</w:t>
-      </w:r>
-      <w:r>
-        <w:rPr>
-          <w:color w:val="334054"/>
-          <w:spacing w:val="-1"/>
-        </w:rPr>
-        <w:t> </w:t>
-      </w:r>
-      <w:r>
-        <w:rPr>
-          <w:color w:val="334054"/>
-        </w:rPr>
-        <w:t>Automation,</w:t>
-      </w:r>
-      <w:r>
-        <w:rPr>
-          <w:color w:val="334054"/>
-          <w:spacing w:val="-2"/>
-        </w:rPr>
-        <w:t> </w:t>
-      </w:r>
-      <w:r>
-        <w:rPr>
-          <w:color w:val="334054"/>
-        </w:rPr>
-        <w:t>Cancellation</w:t>
-      </w:r>
-      <w:r>
-        <w:rPr>
-          <w:color w:val="334054"/>
-          <w:spacing w:val="-1"/>
-        </w:rPr>
-        <w:t> </w:t>
-      </w:r>
-      <w:r>
-        <w:rPr>
-          <w:color w:val="334054"/>
-        </w:rPr>
-        <w:t>Restitution</w:t>
-      </w:r>
-      <w:r>
-        <w:rPr>
-          <w:color w:val="334054"/>
-          <w:spacing w:val="-2"/>
-        </w:rPr>
-        <w:t> </w:t>
-      </w:r>
-      <w:r>
-        <w:rPr>
-          <w:color w:val="334054"/>
-        </w:rPr>
-        <w:t>&amp;</w:t>
-      </w:r>
-      <w:r>
-        <w:rPr>
-          <w:color w:val="334054"/>
-          <w:spacing w:val="-1"/>
-        </w:rPr>
-        <w:t> </w:t>
-      </w:r>
-      <w:r>
-        <w:rPr>
-          <w:color w:val="334054"/>
-        </w:rPr>
-        <w:t>Database</w:t>
-      </w:r>
-      <w:r>
-        <w:rPr>
-          <w:color w:val="334054"/>
-          <w:spacing w:val="-1"/>
-        </w:rPr>
-        <w:t> </w:t>
-      </w:r>
-      <w:r>
-        <w:rPr>
-          <w:color w:val="334054"/>
-          <w:spacing w:val="-2"/>
-        </w:rPr>
-        <w:t>Reset):</w:t>
-      </w:r>
-    </w:p>
-    <w:p>
-      <w:pPr>
-        <w:pStyle w:val="BodyText"/>
-        <w:spacing w:line="297" w:lineRule="auto" w:before="51"/>
-        <w:ind w:left="387"/>
-      </w:pPr>
-      <w:r>
-        <w:rPr>
-          <w:color w:val="334054"/>
-        </w:rPr>
-        <w:t>Implemented</w:t>
-      </w:r>
-      <w:r>
-        <w:rPr>
-          <w:color w:val="334054"/>
-          <w:spacing w:val="-4"/>
-        </w:rPr>
-        <w:t> </w:t>
-      </w:r>
-      <w:r>
-        <w:rPr>
-          <w:color w:val="334054"/>
-        </w:rPr>
-        <w:t>automated</w:t>
-      </w:r>
-      <w:r>
-        <w:rPr>
-          <w:color w:val="334054"/>
-          <w:spacing w:val="-4"/>
-        </w:rPr>
-        <w:t> </w:t>
-      </w:r>
-      <w:r>
-        <w:rPr>
-          <w:color w:val="334054"/>
-        </w:rPr>
-        <w:t>catalog</w:t>
-      </w:r>
-      <w:r>
-        <w:rPr>
-          <w:color w:val="334054"/>
-          <w:spacing w:val="-4"/>
-        </w:rPr>
-        <w:t> </w:t>
-      </w:r>
-      <w:r>
-        <w:rPr>
-          <w:color w:val="334054"/>
-        </w:rPr>
-        <w:t>inventory</w:t>
-      </w:r>
-      <w:r>
-        <w:rPr>
-          <w:color w:val="334054"/>
-          <w:spacing w:val="-4"/>
-        </w:rPr>
-        <w:t> </w:t>
-      </w:r>
-      <w:r>
-        <w:rPr>
-          <w:color w:val="334054"/>
-        </w:rPr>
-        <w:t>stock</w:t>
-      </w:r>
-      <w:r>
-        <w:rPr>
-          <w:color w:val="334054"/>
-          <w:spacing w:val="-4"/>
-        </w:rPr>
-        <w:t> </w:t>
-      </w:r>
-      <w:r>
-        <w:rPr>
-          <w:color w:val="334054"/>
-        </w:rPr>
-        <w:t>decrement</w:t>
-      </w:r>
-      <w:r>
-        <w:rPr>
-          <w:color w:val="334054"/>
-          <w:spacing w:val="-4"/>
-        </w:rPr>
-        <w:t> </w:t>
-      </w:r>
-      <w:r>
-        <w:rPr>
-          <w:color w:val="334054"/>
-        </w:rPr>
-        <w:t>upon</w:t>
-      </w:r>
-      <w:r>
-        <w:rPr>
-          <w:color w:val="334054"/>
-          <w:spacing w:val="-4"/>
-        </w:rPr>
-        <w:t> </w:t>
-      </w:r>
-      <w:r>
-        <w:rPr>
-          <w:color w:val="334054"/>
-        </w:rPr>
-        <w:t>order</w:t>
-      </w:r>
-      <w:r>
-        <w:rPr>
-          <w:color w:val="334054"/>
-          <w:spacing w:val="-4"/>
-        </w:rPr>
-        <w:t> </w:t>
-      </w:r>
-      <w:r>
-        <w:rPr>
-          <w:color w:val="334054"/>
-        </w:rPr>
-        <w:t>completion,</w:t>
-      </w:r>
-      <w:r>
-        <w:rPr>
-          <w:color w:val="334054"/>
-          <w:spacing w:val="-4"/>
-        </w:rPr>
-        <w:t> </w:t>
-      </w:r>
-      <w:r>
-        <w:rPr>
-          <w:color w:val="334054"/>
-        </w:rPr>
-        <w:t>automated</w:t>
-      </w:r>
-      <w:r>
-        <w:rPr>
-          <w:color w:val="334054"/>
-          <w:spacing w:val="-4"/>
-        </w:rPr>
-        <w:t> </w:t>
-      </w:r>
-      <w:r>
-        <w:rPr>
-          <w:color w:val="334054"/>
-        </w:rPr>
-        <w:t>stock replenishment upon order cancellation, de-duplicated store catalog action buttons, added 1-click</w:t>
-      </w:r>
-    </w:p>
-    <w:p>
-      <w:pPr>
-        <w:pStyle w:val="BodyText"/>
-        <w:spacing w:line="262" w:lineRule="exact"/>
-        <w:ind w:left="387"/>
-      </w:pPr>
-      <w:r>
-        <w:rPr>
-          <w:color w:val="334054"/>
-        </w:rPr>
-        <w:t>Database</w:t>
-      </w:r>
-      <w:r>
-        <w:rPr>
-          <w:color w:val="334054"/>
-          <w:spacing w:val="-1"/>
-        </w:rPr>
-        <w:t> </w:t>
-      </w:r>
-      <w:r>
-        <w:rPr>
-          <w:color w:val="334054"/>
-        </w:rPr>
-        <w:t>Reset</w:t>
-      </w:r>
-      <w:r>
-        <w:rPr>
-          <w:color w:val="334054"/>
-          <w:spacing w:val="-1"/>
-        </w:rPr>
-        <w:t> </w:t>
-      </w:r>
-      <w:r>
-        <w:rPr>
-          <w:color w:val="334054"/>
-        </w:rPr>
-        <w:t>modal in</w:t>
-      </w:r>
-      <w:r>
-        <w:rPr>
-          <w:color w:val="334054"/>
-          <w:spacing w:val="-1"/>
-        </w:rPr>
-        <w:t> </w:t>
-      </w:r>
-      <w:r>
-        <w:rPr>
-          <w:color w:val="334054"/>
-        </w:rPr>
-        <w:t>the Admin</w:t>
-      </w:r>
-      <w:r>
-        <w:rPr>
-          <w:color w:val="334054"/>
-          <w:spacing w:val="-1"/>
-        </w:rPr>
-        <w:t> </w:t>
-      </w:r>
-      <w:r>
-        <w:rPr>
-          <w:color w:val="334054"/>
-        </w:rPr>
-        <w:t>Dashboard,</w:t>
-      </w:r>
-      <w:r>
-        <w:rPr>
-          <w:color w:val="334054"/>
-          <w:spacing w:val="-1"/>
-        </w:rPr>
-        <w:t> </w:t>
-      </w:r>
-      <w:r>
-        <w:rPr>
-          <w:color w:val="334054"/>
-        </w:rPr>
-        <w:t>and established</w:t>
-      </w:r>
-      <w:r>
-        <w:rPr>
-          <w:color w:val="334054"/>
-          <w:spacing w:val="-1"/>
-        </w:rPr>
-        <w:t> </w:t>
-      </w:r>
-      <w:r>
-        <w:rPr>
-          <w:color w:val="334054"/>
-        </w:rPr>
-        <w:t>mandatory planning</w:t>
-      </w:r>
-      <w:r>
-        <w:rPr>
-          <w:color w:val="334054"/>
-          <w:spacing w:val="-1"/>
-        </w:rPr>
-        <w:t> </w:t>
-      </w:r>
-      <w:r>
-        <w:rPr>
-          <w:color w:val="334054"/>
-        </w:rPr>
-        <w:t>and </w:t>
-      </w:r>
-      <w:r>
-        <w:rPr>
-          <w:color w:val="334054"/>
-          <w:spacing w:val="-4"/>
-        </w:rPr>
-        <w:t>docs</w:t>
-      </w:r>
-    </w:p>
-    <w:p>
-      <w:pPr>
-        <w:pStyle w:val="BodyText"/>
-        <w:spacing w:before="51"/>
-        <w:ind w:left="387"/>
-      </w:pPr>
-      <w:r>
-        <w:rPr>
-          <w:color w:val="334054"/>
-        </w:rPr>
-        <w:t>synchronization agent </w:t>
-      </w:r>
-      <w:r>
-        <w:rPr>
-          <w:color w:val="334054"/>
-          <w:spacing w:val="-2"/>
-        </w:rPr>
-        <w:t>rules.</w:t>
+          <w:sz w:val="21"/>
+        </w:rPr>
+        <w:t> </w:t>
+      </w:r>
+      <w:r>
+        <w:rPr>
+          <w:b/>
+          <w:color w:val="334054"/>
+          <w:sz w:val="21"/>
+        </w:rPr>
+        <w:t>Corporate</w:t>
+      </w:r>
+      <w:r>
+        <w:rPr>
+          <w:b/>
+          <w:color w:val="334054"/>
+          <w:spacing w:val="-7"/>
+          <w:sz w:val="21"/>
+        </w:rPr>
+        <w:t> </w:t>
+      </w:r>
+      <w:r>
+        <w:rPr>
+          <w:b/>
+          <w:color w:val="334054"/>
+          <w:sz w:val="21"/>
+        </w:rPr>
+        <w:t>Footer):</w:t>
+      </w:r>
+      <w:r>
+        <w:rPr>
+          <w:b/>
+          <w:color w:val="334054"/>
+          <w:spacing w:val="-7"/>
+          <w:sz w:val="21"/>
+        </w:rPr>
+        <w:t> </w:t>
+      </w:r>
+      <w:r>
+        <w:rPr>
+          <w:color w:val="334054"/>
+          <w:sz w:val="21"/>
+        </w:rPr>
+        <w:t>Added</w:t>
+      </w:r>
+      <w:r>
+        <w:rPr>
+          <w:color w:val="334054"/>
+          <w:spacing w:val="-6"/>
+          <w:sz w:val="21"/>
+        </w:rPr>
+        <w:t> </w:t>
+      </w:r>
+      <w:r>
+        <w:rPr>
+          <w:color w:val="334054"/>
+          <w:sz w:val="21"/>
+        </w:rPr>
+        <w:t>PostgreSQL DELETE RLS policies, fixed real-time receipt lightbox preview, built comprehensive corporate footer with Jakarta HQ &amp; customer care contacts, and formalized customer return RMA SOP.</w:t>
       </w:r>
     </w:p>
     <w:p>
@@ -24064,234 +24621,7 @@
         <w:tabs>
           <w:tab w:pos="387" w:val="left" w:leader="none"/>
         </w:tabs>
-        <w:spacing w:line="290" w:lineRule="auto" w:before="155" w:after="0"/>
-        <w:ind w:left="387" w:right="203" w:hanging="255"/>
-        <w:jc w:val="left"/>
-        <w:rPr>
-          <w:sz w:val="21"/>
-        </w:rPr>
-      </w:pPr>
-      <w:r>
-        <w:rPr>
-          <w:b/>
-          <w:color w:val="334054"/>
-          <w:sz w:val="21"/>
-        </w:rPr>
-        <w:t>Session</w:t>
-      </w:r>
-      <w:r>
-        <w:rPr>
-          <w:b/>
-          <w:color w:val="334054"/>
-          <w:spacing w:val="-7"/>
-          <w:sz w:val="21"/>
-        </w:rPr>
-        <w:t> </w:t>
-      </w:r>
-      <w:r>
-        <w:rPr>
-          <w:b/>
-          <w:color w:val="334054"/>
-          <w:sz w:val="21"/>
-        </w:rPr>
-        <w:t>11</w:t>
-      </w:r>
-      <w:r>
-        <w:rPr>
-          <w:b/>
-          <w:color w:val="334054"/>
-          <w:spacing w:val="-7"/>
-          <w:sz w:val="21"/>
-        </w:rPr>
-        <w:t> </w:t>
-      </w:r>
-      <w:r>
-        <w:rPr>
-          <w:b/>
-          <w:color w:val="334054"/>
-          <w:sz w:val="21"/>
-        </w:rPr>
-        <w:t>(Persistent</w:t>
-      </w:r>
-      <w:r>
-        <w:rPr>
-          <w:b/>
-          <w:color w:val="334054"/>
-          <w:spacing w:val="-7"/>
-          <w:sz w:val="21"/>
-        </w:rPr>
-        <w:t> </w:t>
-      </w:r>
-      <w:r>
-        <w:rPr>
-          <w:b/>
-          <w:color w:val="334054"/>
-          <w:sz w:val="21"/>
-        </w:rPr>
-        <w:t>Reset</w:t>
-      </w:r>
-      <w:r>
-        <w:rPr>
-          <w:b/>
-          <w:color w:val="334054"/>
-          <w:spacing w:val="-7"/>
-          <w:sz w:val="21"/>
-        </w:rPr>
-        <w:t> </w:t>
-      </w:r>
-      <w:r>
-        <w:rPr>
-          <w:b/>
-          <w:color w:val="334054"/>
-          <w:sz w:val="21"/>
-        </w:rPr>
-        <w:t>State,</w:t>
-      </w:r>
-      <w:r>
-        <w:rPr>
-          <w:b/>
-          <w:color w:val="334054"/>
-          <w:spacing w:val="-7"/>
-          <w:sz w:val="21"/>
-        </w:rPr>
-        <w:t> </w:t>
-      </w:r>
-      <w:r>
-        <w:rPr>
-          <w:b/>
-          <w:color w:val="334054"/>
-          <w:sz w:val="21"/>
-        </w:rPr>
-        <w:t>Realtime</w:t>
-      </w:r>
-      <w:r>
-        <w:rPr>
-          <w:b/>
-          <w:color w:val="334054"/>
-          <w:spacing w:val="-7"/>
-          <w:sz w:val="21"/>
-        </w:rPr>
-        <w:t> </w:t>
-      </w:r>
-      <w:r>
-        <w:rPr>
-          <w:b/>
-          <w:color w:val="334054"/>
-          <w:sz w:val="21"/>
-        </w:rPr>
-        <w:t>Receipt</w:t>
-      </w:r>
-      <w:r>
-        <w:rPr>
-          <w:b/>
-          <w:color w:val="334054"/>
-          <w:spacing w:val="-7"/>
-          <w:sz w:val="21"/>
-        </w:rPr>
-        <w:t> </w:t>
-      </w:r>
-      <w:r>
-        <w:rPr>
-          <w:b/>
-          <w:color w:val="334054"/>
-          <w:sz w:val="21"/>
-        </w:rPr>
-        <w:t>Fix</w:t>
-      </w:r>
-      <w:r>
-        <w:rPr>
-          <w:b/>
-          <w:color w:val="334054"/>
-          <w:spacing w:val="-7"/>
-          <w:sz w:val="21"/>
-        </w:rPr>
-        <w:t> </w:t>
-      </w:r>
-      <w:r>
-        <w:rPr>
-          <w:b/>
-          <w:color w:val="334054"/>
-          <w:sz w:val="21"/>
-        </w:rPr>
-        <w:t>&amp;</w:t>
-      </w:r>
-      <w:r>
-        <w:rPr>
-          <w:b/>
-          <w:color w:val="334054"/>
-          <w:spacing w:val="-7"/>
-          <w:sz w:val="21"/>
-        </w:rPr>
-        <w:t> </w:t>
-      </w:r>
-      <w:r>
-        <w:rPr>
-          <w:b/>
-          <w:color w:val="334054"/>
-          <w:sz w:val="21"/>
-        </w:rPr>
-        <w:t>Corporate</w:t>
-      </w:r>
-      <w:r>
-        <w:rPr>
-          <w:b/>
-          <w:color w:val="334054"/>
-          <w:spacing w:val="-7"/>
-          <w:sz w:val="21"/>
-        </w:rPr>
-        <w:t> </w:t>
-      </w:r>
-      <w:r>
-        <w:rPr>
-          <w:b/>
-          <w:color w:val="334054"/>
-          <w:sz w:val="21"/>
-        </w:rPr>
-        <w:t>Footer):</w:t>
-      </w:r>
-      <w:r>
-        <w:rPr>
-          <w:b/>
-          <w:color w:val="334054"/>
-          <w:spacing w:val="-7"/>
-          <w:sz w:val="21"/>
-        </w:rPr>
-        <w:t> </w:t>
-      </w:r>
-      <w:r>
-        <w:rPr>
-          <w:color w:val="334054"/>
-          <w:sz w:val="21"/>
-        </w:rPr>
-        <w:t>Added</w:t>
-      </w:r>
-      <w:r>
-        <w:rPr>
-          <w:color w:val="334054"/>
-          <w:spacing w:val="-6"/>
-          <w:sz w:val="21"/>
-        </w:rPr>
-        <w:t> </w:t>
-      </w:r>
-      <w:r>
-        <w:rPr>
-          <w:color w:val="334054"/>
-          <w:sz w:val="21"/>
-        </w:rPr>
-        <w:t>PostgreSQL DELETE RLS policies, fixed real-time receipt lightbox preview, built comprehensive corporate footer with Jakarta HQ &amp; customer care contacts, and formalized customer return RMA SOP.</w:t>
-      </w:r>
-    </w:p>
-    <w:p>
-      <w:pPr>
-        <w:pStyle w:val="ListParagraph"/>
-        <w:numPr>
-          <w:ilvl w:val="0"/>
-          <w:numId w:val="5"/>
-        </w:numPr>
-        <w:tabs>
-          <w:tab w:pos="387" w:val="left" w:leader="none"/>
-        </w:tabs>
-        <w:spacing w:line="283" w:lineRule="auto" w:before="81" w:after="0"/>
+        <w:spacing w:line="283" w:lineRule="auto" w:before="106" w:after="0"/>
         <w:ind w:left="387" w:right="577" w:hanging="255"/>
         <w:jc w:val="left"/>
         <w:rPr>
@@ -24478,8 +24808,8 @@
     <w:p>
       <w:pPr>
         <w:pStyle w:val="BodyText"/>
-        <w:spacing w:line="302" w:lineRule="auto" w:before="16"/>
-        <w:ind w:left="387" w:right="262"/>
+        <w:spacing w:line="297" w:lineRule="auto" w:before="16"/>
+        <w:ind w:left="387" w:right="136"/>
       </w:pPr>
       <w:r>
         <w:rPr>
@@ -24616,7 +24946,7 @@
     <w:p>
       <w:pPr>
         <w:pStyle w:val="BodyText"/>
-        <w:spacing w:before="256"/>
+        <w:spacing w:before="272"/>
       </w:pPr>
     </w:p>
     <w:p>
@@ -24629,7 +24959,7 @@
         <w:tabs>
           <w:tab w:pos="385" w:val="left" w:leader="none"/>
         </w:tabs>
-        <w:spacing w:line="240" w:lineRule="auto" w:before="0" w:after="0"/>
+        <w:spacing w:line="240" w:lineRule="auto" w:before="1" w:after="0"/>
         <w:ind w:left="385" w:right="0" w:hanging="358"/>
         <w:jc w:val="left"/>
       </w:pPr>
@@ -24728,7 +25058,7 @@
     <w:p>
       <w:pPr>
         <w:pStyle w:val="BodyText"/>
-        <w:spacing w:before="13"/>
+        <w:spacing w:before="12"/>
         <w:rPr>
           <w:b/>
           <w:sz w:val="7"/>
@@ -24748,7 +25078,7 @@
                   <wp:posOffset>647700</wp:posOffset>
                 </wp:positionH>
                 <wp:positionV relativeFrom="paragraph">
-                  <wp:posOffset>82728</wp:posOffset>
+                  <wp:posOffset>82284</wp:posOffset>
                 </wp:positionV>
                 <wp:extent cx="6264275" cy="9525"/>
                 <wp:effectExtent l="0" t="0" r="0" b="0"/>
@@ -24812,7 +25142,7 @@
           </mc:Choice>
           <mc:Fallback>
             <w:pict>
-              <v:rect style="position:absolute;margin-left:51.000004pt;margin-top:6.514063pt;width:493.230444pt;height:.75pt;mso-position-horizontal-relative:page;mso-position-vertical-relative:paragraph;z-index:-15724032;mso-wrap-distance-left:0;mso-wrap-distance-right:0" id="docshape48" filled="true" fillcolor="#cbd5e1" stroked="false">
+              <v:rect style="position:absolute;margin-left:51.000004pt;margin-top:6.479126pt;width:493.230444pt;height:.75pt;mso-position-horizontal-relative:page;mso-position-vertical-relative:paragraph;z-index:-15724032;mso-wrap-distance-left:0;mso-wrap-distance-right:0" id="docshape48" filled="true" fillcolor="#cbd5e1" stroked="false">
                 <v:fill type="solid"/>
                 <w10:wrap type="topAndBottom"/>
               </v:rect>
@@ -24844,30 +25174,14 @@
     <w:p>
       <w:pPr>
         <w:pStyle w:val="BodyText"/>
-        <w:rPr>
-          <w:sz w:val="20"/>
-        </w:rPr>
-      </w:pPr>
-    </w:p>
-    <w:p>
-      <w:pPr>
-        <w:pStyle w:val="BodyText"/>
-        <w:rPr>
-          <w:sz w:val="20"/>
-        </w:rPr>
-      </w:pPr>
-    </w:p>
-    <w:p>
-      <w:pPr>
-        <w:pStyle w:val="BodyText"/>
-        <w:spacing w:before="104"/>
-        <w:rPr>
-          <w:sz w:val="20"/>
-        </w:rPr>
-      </w:pPr>
-      <w:r>
-        <w:rPr>
-          <w:sz w:val="20"/>
+        <w:spacing w:before="2"/>
+        <w:rPr>
+          <w:sz w:val="9"/>
+        </w:rPr>
+      </w:pPr>
+      <w:r>
+        <w:rPr>
+          <w:sz w:val="9"/>
         </w:rPr>
         <mc:AlternateContent>
           <mc:Choice Requires="wps">
@@ -24878,7 +25192,7 @@
                   <wp:posOffset>647700</wp:posOffset>
                 </wp:positionH>
                 <wp:positionV relativeFrom="paragraph">
-                  <wp:posOffset>250199</wp:posOffset>
+                  <wp:posOffset>92523</wp:posOffset>
                 </wp:positionV>
                 <wp:extent cx="6264275" cy="116839"/>
                 <wp:effectExtent l="0" t="0" r="0" b="0"/>
@@ -24944,7 +25258,7 @@
           </mc:Choice>
           <mc:Fallback>
             <w:pict>
-              <v:rect style="position:absolute;margin-left:51pt;margin-top:19.700781pt;width:493.230466pt;height:9.159840pt;mso-position-horizontal-relative:page;mso-position-vertical-relative:paragraph;z-index:-15723520;mso-wrap-distance-left:0;mso-wrap-distance-right:0" id="docshape49" filled="true" fillcolor="#000000" stroked="false">
+              <v:rect style="position:absolute;margin-left:51pt;margin-top:7.285352pt;width:493.230466pt;height:9.159840pt;mso-position-horizontal-relative:page;mso-position-vertical-relative:paragraph;z-index:-15723520;mso-wrap-distance-left:0;mso-wrap-distance-right:0" id="docshape49" filled="true" fillcolor="#000000" stroked="false">
                 <v:fill opacity="3853f" type="solid"/>
                 <w10:wrap type="topAndBottom"/>
               </v:rect>
@@ -24958,7 +25272,7 @@
         <w:pStyle w:val="BodyText"/>
         <w:spacing w:after="0"/>
         <w:rPr>
-          <w:sz w:val="20"/>
+          <w:sz w:val="9"/>
         </w:rPr>
         <w:sectPr>
           <w:pgSz w:w="11900" w:h="16840"/>
@@ -27083,7 +27397,7 @@
     <w:p>
       <w:pPr>
         <w:spacing w:line="283" w:lineRule="auto" w:before="178"/>
-        <w:ind w:left="312" w:right="262" w:firstLine="0"/>
+        <w:ind w:left="312" w:right="136" w:firstLine="0"/>
         <w:jc w:val="left"/>
         <w:rPr>
           <w:sz w:val="20"/>
@@ -27096,7 +27410,7 @@
         <mc:AlternateContent>
           <mc:Choice Requires="wps">
             <w:drawing>
-              <wp:anchor distT="0" distB="0" distL="0" distR="0" allowOverlap="1" layoutInCell="1" locked="0" behindDoc="1" simplePos="0" relativeHeight="487134720">
+              <wp:anchor distT="0" distB="0" distL="0" distR="0" allowOverlap="1" layoutInCell="1" locked="0" behindDoc="1" simplePos="0" relativeHeight="487136256">
                 <wp:simplePos x="0" y="0"/>
                 <wp:positionH relativeFrom="page">
                   <wp:posOffset>647699</wp:posOffset>
@@ -27744,7 +28058,7 @@
           </mc:Choice>
           <mc:Fallback>
             <w:pict>
-              <v:group style="position:absolute;margin-left:50.999996pt;margin-top:-312.520142pt;width:493.5pt;height:378.4pt;mso-position-horizontal-relative:page;mso-position-vertical-relative:paragraph;z-index:-16181760" id="docshapegroup60" coordorigin="1020,-6250" coordsize="9870,7568">
+              <v:group style="position:absolute;margin-left:50.999996pt;margin-top:-312.520142pt;width:493.5pt;height:378.4pt;mso-position-horizontal-relative:page;mso-position-vertical-relative:paragraph;z-index:-16180224" id="docshapegroup60" coordorigin="1020,-6250" coordsize="9870,7568">
                 <v:shape style="position:absolute;left:1020;top:-6251;width:9865;height:7568" id="docshape61" coordorigin="1020,-6250" coordsize="9865,7568" path="m10885,1317l1020,1317,1020,-6250,10885,-6250,10885,-6235,1200,-6235,1184,-6235,1168,-6232,1152,-6228,1137,-6223,1122,-6216,1108,-6208,1095,-6198,1083,-6187,1072,-6175,1063,-6162,1055,-6148,1048,-6134,1042,-6118,1038,-6103,1036,-6087,1035,-6070,1035,830,1036,846,1038,862,1042,877,1048,893,1055,907,1063,921,1072,934,1083,946,1095,957,1108,967,1122,975,1137,982,1152,988,1168,991,1184,994,1200,995,10885,995,10885,1317xm10885,995l10710,995,10726,994,10742,991,10758,988,10773,982,10788,975,10802,967,10815,957,10827,946,10838,934,10847,921,10855,907,10862,893,10868,877,10872,862,10874,846,10875,830,10875,-6070,10874,-6087,10872,-6103,10868,-6118,10862,-6134,10855,-6148,10847,-6162,10838,-6175,10827,-6187,10815,-6198,10802,-6208,10788,-6216,10773,-6223,10758,-6228,10742,-6232,10726,-6235,10710,-6235,10885,-6235,10885,995xe" filled="true" fillcolor="#000000" stroked="false">
                   <v:path arrowok="t"/>
                   <v:fill opacity="3853f" type="solid"/>
@@ -28382,7 +28696,7 @@
         <mc:AlternateContent>
           <mc:Choice Requires="wps">
             <w:drawing>
-              <wp:anchor distT="0" distB="0" distL="0" distR="0" allowOverlap="1" layoutInCell="1" locked="0" behindDoc="1" simplePos="0" relativeHeight="487135744">
+              <wp:anchor distT="0" distB="0" distL="0" distR="0" allowOverlap="1" layoutInCell="1" locked="0" behindDoc="1" simplePos="0" relativeHeight="487137280">
                 <wp:simplePos x="0" y="0"/>
                 <wp:positionH relativeFrom="page">
                   <wp:posOffset>647699</wp:posOffset>
@@ -29024,7 +29338,7 @@
           </mc:Choice>
           <mc:Fallback>
             <w:pict>
-              <v:group style="position:absolute;margin-left:50.999996pt;margin-top:-312.520172pt;width:493.5pt;height:378.4pt;mso-position-horizontal-relative:page;mso-position-vertical-relative:paragraph;z-index:-16180736" id="docshapegroup67" coordorigin="1020,-6250" coordsize="9870,7568">
+              <v:group style="position:absolute;margin-left:50.999996pt;margin-top:-312.520172pt;width:493.5pt;height:378.4pt;mso-position-horizontal-relative:page;mso-position-vertical-relative:paragraph;z-index:-16179200" id="docshapegroup67" coordorigin="1020,-6250" coordsize="9870,7568">
                 <v:shape style="position:absolute;left:1020;top:-6251;width:9865;height:7568" id="docshape68" coordorigin="1020,-6250" coordsize="9865,7568" path="m10885,1317l1020,1317,1020,-6250,10885,-6250,10885,-6235,1200,-6235,1184,-6235,1168,-6232,1152,-6228,1137,-6223,1122,-6216,1108,-6208,1095,-6198,1083,-6187,1072,-6175,1063,-6162,1055,-6148,1048,-6134,1042,-6118,1038,-6103,1036,-6087,1035,-6070,1035,830,1036,846,1038,862,1042,877,1048,893,1055,907,1063,921,1072,934,1083,946,1095,957,1108,967,1122,975,1137,982,1152,988,1168,991,1184,994,1200,995,10885,995,10885,1317xm10885,995l10710,995,10726,994,10742,991,10758,988,10773,982,10788,975,10802,967,10815,957,10827,946,10838,934,10847,921,10855,907,10862,893,10868,877,10872,862,10874,846,10875,830,10875,-6070,10874,-6087,10872,-6103,10868,-6118,10862,-6134,10855,-6148,10847,-6162,10838,-6175,10827,-6187,10815,-6198,10802,-6208,10788,-6216,10773,-6223,10758,-6228,10742,-6232,10726,-6235,10710,-6235,10885,-6235,10885,995xe" filled="true" fillcolor="#000000" stroked="false">
                   <v:path arrowok="t"/>
                   <v:fill opacity="3853f" type="solid"/>
@@ -31569,7 +31883,7 @@
     <w:p>
       <w:pPr>
         <w:spacing w:line="283" w:lineRule="auto" w:before="178"/>
-        <w:ind w:left="312" w:right="262" w:firstLine="0"/>
+        <w:ind w:left="312" w:right="566" w:firstLine="0"/>
         <w:jc w:val="left"/>
         <w:rPr>
           <w:sz w:val="20"/>
@@ -31582,7 +31896,7 @@
         <mc:AlternateContent>
           <mc:Choice Requires="wps">
             <w:drawing>
-              <wp:anchor distT="0" distB="0" distL="0" distR="0" allowOverlap="1" layoutInCell="1" locked="0" behindDoc="1" simplePos="0" relativeHeight="487137792">
+              <wp:anchor distT="0" distB="0" distL="0" distR="0" allowOverlap="1" layoutInCell="1" locked="0" behindDoc="1" simplePos="0" relativeHeight="487139328">
                 <wp:simplePos x="0" y="0"/>
                 <wp:positionH relativeFrom="page">
                   <wp:posOffset>647699</wp:posOffset>
@@ -32221,7 +32535,7 @@
           </mc:Choice>
           <mc:Fallback>
             <w:pict>
-              <v:group style="position:absolute;margin-left:50.999996pt;margin-top:-312.520233pt;width:493.5pt;height:378.4pt;mso-position-horizontal-relative:page;mso-position-vertical-relative:paragraph;z-index:-16178688" id="docshapegroup84" coordorigin="1020,-6250" coordsize="9870,7568">
+              <v:group style="position:absolute;margin-left:50.999996pt;margin-top:-312.520233pt;width:493.5pt;height:378.4pt;mso-position-horizontal-relative:page;mso-position-vertical-relative:paragraph;z-index:-16177152" id="docshapegroup84" coordorigin="1020,-6250" coordsize="9870,7568">
                 <v:shape style="position:absolute;left:1020;top:-6251;width:9865;height:7568" id="docshape85" coordorigin="1020,-6250" coordsize="9865,7568" path="m10885,1317l1020,1317,1020,-6250,10885,-6250,10885,-6235,1200,-6235,1184,-6235,1168,-6232,1152,-6228,1137,-6223,1122,-6216,1108,-6208,1095,-6198,1083,-6187,1072,-6175,1063,-6162,1055,-6148,1048,-6134,1042,-6118,1038,-6103,1036,-6087,1035,-6070,1035,830,1036,846,1038,862,1042,877,1048,893,1055,907,1063,921,1072,934,1083,946,1095,957,1108,967,1122,975,1137,982,1152,988,1168,991,1184,994,1200,995,10885,995,10885,1317xm10885,995l10710,995,10726,994,10742,991,10758,988,10773,982,10788,975,10802,967,10815,957,10827,946,10838,934,10847,921,10855,907,10862,893,10868,877,10872,862,10874,846,10875,830,10875,-6070,10874,-6087,10872,-6103,10868,-6118,10862,-6134,10855,-6148,10847,-6162,10838,-6175,10827,-6187,10815,-6198,10802,-6208,10788,-6216,10773,-6223,10758,-6228,10742,-6232,10726,-6235,10710,-6235,10885,-6235,10885,995xe" filled="true" fillcolor="#000000" stroked="false">
                   <v:path arrowok="t"/>
                   <v:fill opacity="3853f" type="solid"/>
@@ -35238,7 +35552,7 @@
         <mc:AlternateContent>
           <mc:Choice Requires="wps">
             <w:drawing>
-              <wp:anchor distT="0" distB="0" distL="0" distR="0" allowOverlap="1" layoutInCell="1" locked="0" behindDoc="1" simplePos="0" relativeHeight="487139840">
+              <wp:anchor distT="0" distB="0" distL="0" distR="0" allowOverlap="1" layoutInCell="1" locked="0" behindDoc="1" simplePos="0" relativeHeight="487141376">
                 <wp:simplePos x="0" y="0"/>
                 <wp:positionH relativeFrom="page">
                   <wp:posOffset>647699</wp:posOffset>
@@ -35901,7 +36215,7 @@
           </mc:Choice>
           <mc:Fallback>
             <w:pict>
-              <v:group style="position:absolute;margin-left:50.999996pt;margin-top:-312.520294pt;width:493.5pt;height:378.4pt;mso-position-horizontal-relative:page;mso-position-vertical-relative:paragraph;z-index:-16176640" id="docshapegroup101" coordorigin="1020,-6250" coordsize="9870,7568">
+              <v:group style="position:absolute;margin-left:50.999996pt;margin-top:-312.520294pt;width:493.5pt;height:378.4pt;mso-position-horizontal-relative:page;mso-position-vertical-relative:paragraph;z-index:-16175104" id="docshapegroup101" coordorigin="1020,-6250" coordsize="9870,7568">
                 <v:shape style="position:absolute;left:1020;top:-6251;width:9865;height:7568" id="docshape102" coordorigin="1020,-6250" coordsize="9865,7568" path="m10885,1317l1020,1317,1020,-6250,10885,-6250,10885,-6235,1200,-6235,1184,-6235,1168,-6232,1152,-6228,1137,-6223,1122,-6216,1108,-6208,1095,-6198,1083,-6187,1072,-6175,1063,-6162,1055,-6148,1048,-6134,1042,-6118,1038,-6103,1036,-6087,1035,-6070,1035,830,1036,846,1038,862,1042,877,1048,893,1055,907,1063,921,1072,934,1083,946,1095,957,1108,967,1122,975,1137,982,1152,988,1168,991,1184,994,1200,995,10885,995,10885,1317xm10885,995l10710,995,10726,994,10742,991,10758,988,10773,982,10788,975,10802,967,10815,957,10827,946,10838,934,10847,921,10855,907,10862,893,10868,877,10872,862,10874,846,10875,830,10875,-6070,10874,-6087,10872,-6103,10868,-6118,10862,-6134,10855,-6148,10847,-6162,10838,-6175,10827,-6187,10815,-6198,10802,-6208,10788,-6216,10773,-6223,10758,-6228,10742,-6232,10726,-6235,10710,-6235,10885,-6235,10885,995xe" filled="true" fillcolor="#000000" stroked="false">
                   <v:path arrowok="t"/>
                   <v:fill opacity="3853f" type="solid"/>
@@ -36509,7 +36823,7 @@
     <w:p>
       <w:pPr>
         <w:spacing w:line="283" w:lineRule="auto" w:before="178"/>
-        <w:ind w:left="312" w:right="262" w:firstLine="0"/>
+        <w:ind w:left="312" w:right="136" w:firstLine="0"/>
         <w:jc w:val="left"/>
         <w:rPr>
           <w:sz w:val="20"/>
@@ -36522,7 +36836,7 @@
         <mc:AlternateContent>
           <mc:Choice Requires="wps">
             <w:drawing>
-              <wp:anchor distT="0" distB="0" distL="0" distR="0" allowOverlap="1" layoutInCell="1" locked="0" behindDoc="1" simplePos="0" relativeHeight="487140352">
+              <wp:anchor distT="0" distB="0" distL="0" distR="0" allowOverlap="1" layoutInCell="1" locked="0" behindDoc="1" simplePos="0" relativeHeight="487141888">
                 <wp:simplePos x="0" y="0"/>
                 <wp:positionH relativeFrom="page">
                   <wp:posOffset>647699</wp:posOffset>
@@ -37137,7 +37451,7 @@
           </mc:Choice>
           <mc:Fallback>
             <w:pict>
-              <v:group style="position:absolute;margin-left:50.999996pt;margin-top:-312.520325pt;width:493.5pt;height:378.4pt;mso-position-horizontal-relative:page;mso-position-vertical-relative:paragraph;z-index:-16176128" id="docshapegroup108" coordorigin="1020,-6250" coordsize="9870,7568">
+              <v:group style="position:absolute;margin-left:50.999996pt;margin-top:-312.520325pt;width:493.5pt;height:378.4pt;mso-position-horizontal-relative:page;mso-position-vertical-relative:paragraph;z-index:-16174592" id="docshapegroup108" coordorigin="1020,-6250" coordsize="9870,7568">
                 <v:shape style="position:absolute;left:1020;top:-6251;width:9865;height:7568" id="docshape109" coordorigin="1020,-6250" coordsize="9865,7568" path="m10885,1317l1020,1317,1020,-6250,10885,-6250,10885,-6235,1200,-6235,1184,-6235,1168,-6232,1152,-6228,1137,-6223,1122,-6216,1108,-6208,1095,-6198,1083,-6187,1072,-6175,1063,-6162,1055,-6148,1048,-6134,1042,-6118,1038,-6103,1036,-6087,1035,-6070,1035,830,1036,846,1038,862,1042,877,1048,893,1055,907,1063,921,1072,934,1083,946,1095,957,1108,967,1122,975,1137,982,1152,988,1168,991,1184,994,1200,995,10885,995,10885,1317xm10885,995l10710,995,10726,994,10742,991,10758,988,10773,982,10788,975,10802,967,10815,957,10827,946,10838,934,10847,921,10855,907,10862,893,10868,877,10872,862,10874,846,10875,830,10875,-6070,10874,-6087,10872,-6103,10868,-6118,10862,-6134,10855,-6148,10847,-6162,10838,-6175,10827,-6187,10815,-6198,10802,-6208,10788,-6216,10773,-6223,10758,-6228,10742,-6232,10726,-6235,10710,-6235,10885,-6235,10885,995xe" filled="true" fillcolor="#000000" stroked="false">
                   <v:path arrowok="t"/>
                   <v:fill opacity="3853f" type="solid"/>
@@ -37631,7 +37945,7 @@
   <w:numPicBullet w:numPicBulletId="3">
     <w:pict>
       <v:shape id="_x0000_i1078" type="#_x0000_t75" style="width:7.500000pt;height:7.500000pt" o:bullet="t">
-        <v:imagedata r:id="rId1" o:title="image1.png"/>
+        <v:imagedata r:id="rId4" o:title="image5.png"/>
       </v:shape>
     </w:pict>
   </w:numPicBullet>
@@ -38436,7 +38750,7 @@
     <w:uiPriority w:val="1"/>
     <w:qFormat/>
     <w:pPr>
-      <w:spacing w:before="155"/>
+      <w:spacing w:before="105"/>
       <w:ind w:left="387" w:hanging="255"/>
       <w:outlineLvl w:val="3"/>
     </w:pPr>
@@ -38474,6 +38788,7 @@
     <w:uiPriority w:val="1"/>
     <w:qFormat/>
     <w:pPr>
+      <w:spacing w:before="106"/>
       <w:ind w:left="387" w:hanging="255"/>
     </w:pPr>
     <w:rPr>

</xml_diff>